<commit_message>
Cosas vistas en clase 06-05
</commit_message>
<xml_diff>
--- a/Códigos teoría/Guía de TPs/Práctica VI (Complejidad Computacional)/Resolución.docx
+++ b/Códigos teoría/Guía de TPs/Práctica VI (Complejidad Computacional)/Resolución.docx
@@ -18,13 +18,7 @@
         <w:rPr>
           <w:lang w:val="es-ES"/>
         </w:rPr>
-        <w:t xml:space="preserve">1) </w:t>
-      </w:r>
-      <w:r>
-        <w:rPr>
-          <w:lang w:val="es-ES"/>
-        </w:rPr>
-        <w:t xml:space="preserve">Para cada una de las funciones siguientes indique su orden de crecimiento con la notación O(f(n)) y ordene por velocidad de crecimiento (en sentido creciente) </w:t>
+        <w:t xml:space="preserve">1) Para cada una de las funciones siguientes indique su orden de crecimiento con la notación O(f(n)) y ordene por velocidad de crecimiento (en sentido creciente) </w:t>
       </w:r>
       <w:r>
         <w:rPr>
@@ -229,18 +223,7 @@
           <w:lang w:val="es-ES"/>
         </w:rPr>
         <w:br/>
-        <w:t xml:space="preserve">O(1) &lt; O(log(n)) &lt; </w:t>
-      </w:r>
-      <w:r>
-        <w:rPr>
-          <w:rFonts w:ascii="Arial" w:hAnsi="Arial" w:cs="Arial"/>
-          <w:b/>
-          <w:bCs/>
-          <w:sz w:val="24"/>
-          <w:szCs w:val="24"/>
-          <w:lang w:val="es-ES"/>
-        </w:rPr>
-        <w:t>O(n)</w:t>
+        <w:t>O(1) &lt; O(log(n)) &lt; O(n)</w:t>
       </w:r>
     </w:p>
     <w:p>
@@ -876,17 +859,38 @@
           <w:szCs w:val="24"/>
           <w:lang w:val="es-ES"/>
         </w:rPr>
-        <w:t>como (2+1)</w:t>
-      </w:r>
+        <w:t>como (2+</w:t>
+      </w:r>
+      <w:proofErr w:type="gramStart"/>
       <w:r>
         <w:rPr>
           <w:rFonts w:ascii="Arial" w:eastAsia="MS PGothic" w:hAnsi="Arial" w:cs="Arial"/>
           <w:sz w:val="24"/>
           <w:szCs w:val="24"/>
+          <w:lang w:val="es-ES"/>
+        </w:rPr>
+        <w:t>1)</w:t>
+      </w:r>
+      <w:r>
+        <w:rPr>
+          <w:rFonts w:ascii="Arial" w:eastAsia="MS PGothic" w:hAnsi="Arial" w:cs="Arial"/>
+          <w:sz w:val="24"/>
+          <w:szCs w:val="24"/>
           <w:vertAlign w:val="superscript"/>
           <w:lang w:val="es-ES"/>
         </w:rPr>
-        <w:t xml:space="preserve">n </w:t>
+        <w:t>n</w:t>
+      </w:r>
+      <w:proofErr w:type="gramEnd"/>
+      <w:r>
+        <w:rPr>
+          <w:rFonts w:ascii="Arial" w:eastAsia="MS PGothic" w:hAnsi="Arial" w:cs="Arial"/>
+          <w:sz w:val="24"/>
+          <w:szCs w:val="24"/>
+          <w:vertAlign w:val="superscript"/>
+          <w:lang w:val="es-ES"/>
+        </w:rPr>
+        <w:t xml:space="preserve"> </w:t>
       </w:r>
       <w:r>
         <w:rPr>
@@ -992,18 +996,27 @@
         <w:rPr>
           <w:lang w:val="es-ES"/>
         </w:rPr>
-        <w:t>Suponiendo que se sabe que el tiempo de ejecución de un algoritmo pertenece a O(NlogN) y que el de otro algoritmo pertenece a O(n2), se pide:</w:t>
+        <w:t>Suponiendo que se sabe que el tiempo de ejecución de un algoritmo pertenece a O(</w:t>
+      </w:r>
+      <w:proofErr w:type="spellStart"/>
+      <w:r>
+        <w:rPr>
+          <w:lang w:val="es-ES"/>
+        </w:rPr>
+        <w:t>NlogN</w:t>
+      </w:r>
+      <w:proofErr w:type="spellEnd"/>
+      <w:r>
+        <w:rPr>
+          <w:lang w:val="es-ES"/>
+        </w:rPr>
+        <w:t>) y que el de otro algoritmo pertenece a O(n2), se pide:</w:t>
       </w:r>
       <w:r>
         <w:rPr>
           <w:lang w:val="es-ES"/>
         </w:rPr>
         <w:br/>
-      </w:r>
-      <w:r>
-        <w:rPr>
-          <w:lang w:val="es-ES"/>
-        </w:rPr>
         <w:t xml:space="preserve"> </w:t>
       </w:r>
     </w:p>
@@ -1031,19 +1044,7 @@
         <w:rPr>
           <w:lang w:val="es-ES"/>
         </w:rPr>
-        <w:t>Que se puede decir sobre el rendimien</w:t>
-      </w:r>
-      <w:r>
-        <w:rPr>
-          <w:lang w:val="es-ES"/>
-        </w:rPr>
-        <w:t>to relativo de estos algoritmos</w:t>
-      </w:r>
-      <w:r>
-        <w:rPr>
-          <w:lang w:val="es-ES"/>
-        </w:rPr>
-        <w:t>?</w:t>
+        <w:t>Que se puede decir sobre el rendimiento relativo de estos algoritmos?</w:t>
       </w:r>
       <w:r>
         <w:rPr>
@@ -1056,7 +1057,21 @@
           <w:lang w:val="es-ES"/>
         </w:rPr>
         <w:br/>
-        <w:t>El primero crece más lento que el segundo, por lo que en casos en los que N sea muy grande, O(nlog(n)) será mejor.</w:t>
+        <w:t>El primero crece más lento que el segundo, por lo que en casos en los que N sea muy grande, O(</w:t>
+      </w:r>
+      <w:proofErr w:type="spellStart"/>
+      <w:r>
+        <w:rPr>
+          <w:lang w:val="es-ES"/>
+        </w:rPr>
+        <w:t>nlog</w:t>
+      </w:r>
+      <w:proofErr w:type="spellEnd"/>
+      <w:r>
+        <w:rPr>
+          <w:lang w:val="es-ES"/>
+        </w:rPr>
+        <w:t>(n)) será mejor.</w:t>
       </w:r>
       <w:r>
         <w:rPr>
@@ -1069,11 +1084,6 @@
           <w:lang w:val="es-ES"/>
         </w:rPr>
         <w:br/>
-      </w:r>
-      <w:r>
-        <w:rPr>
-          <w:lang w:val="es-ES"/>
-        </w:rPr>
         <w:t xml:space="preserve">b) Suponiendo que ambos algoritmos resuelvan el mismo problema, enumere en cuales caso implementaría uno y en cuales implementaría el otro. </w:t>
       </w:r>
       <w:r>
@@ -1088,7 +1098,7 @@
         </w:rPr>
         <w:br/>
       </w:r>
-      <w:hyperlink r:id="rId4" w:history="1">
+      <w:hyperlink r:id="rId5" w:history="1">
         <w:r>
           <w:rPr>
             <w:rStyle w:val="Hipervnculo"/>
@@ -1127,7 +1137,21 @@
         <w:rPr>
           <w:lang w:val="es-ES"/>
         </w:rPr>
-        <w:t>) es mejor que O(nlog(n)) cuando n &lt; 100 en la vida real. Así que implementaría O(n</w:t>
+        <w:t>) es mejor que O(</w:t>
+      </w:r>
+      <w:proofErr w:type="spellStart"/>
+      <w:r>
+        <w:rPr>
+          <w:lang w:val="es-ES"/>
+        </w:rPr>
+        <w:t>nlog</w:t>
+      </w:r>
+      <w:proofErr w:type="spellEnd"/>
+      <w:r>
+        <w:rPr>
+          <w:lang w:val="es-ES"/>
+        </w:rPr>
+        <w:t>(n)) cuando n &lt; 100 en la vida real. Así que implementaría O(n</w:t>
       </w:r>
       <w:r>
         <w:rPr>
@@ -1166,43 +1190,7 @@
           <w:szCs w:val="24"/>
           <w:lang w:val="es-ES"/>
         </w:rPr>
-        <w:t xml:space="preserve">c) </w:t>
-      </w:r>
-      <w:r>
-        <w:rPr>
-          <w:rFonts w:ascii="Arial" w:hAnsi="Arial" w:cs="Arial"/>
-          <w:sz w:val="24"/>
-          <w:szCs w:val="24"/>
-          <w:lang w:val="es-ES"/>
-        </w:rPr>
-        <w:t>E</w:t>
-      </w:r>
-      <w:r>
-        <w:rPr>
-          <w:rFonts w:ascii="Arial" w:hAnsi="Arial" w:cs="Arial"/>
-          <w:sz w:val="24"/>
-          <w:szCs w:val="24"/>
-          <w:lang w:val="es-ES"/>
-        </w:rPr>
-        <w:t xml:space="preserve">n el caso de que ambos algoritmos sean de ordenación interna, enumere situaciones donde sería </w:t>
-      </w:r>
-      <w:r>
-        <w:rPr>
-          <w:rFonts w:ascii="Arial" w:hAnsi="Arial" w:cs="Arial"/>
-          <w:sz w:val="24"/>
-          <w:szCs w:val="24"/>
-          <w:lang w:val="es-ES"/>
-        </w:rPr>
-        <w:t>válido</w:t>
-      </w:r>
-      <w:r>
-        <w:rPr>
-          <w:rFonts w:ascii="Arial" w:hAnsi="Arial" w:cs="Arial"/>
-          <w:sz w:val="24"/>
-          <w:szCs w:val="24"/>
-          <w:lang w:val="es-ES"/>
-        </w:rPr>
-        <w:t xml:space="preserve"> usar el algoritmo cuadrático.</w:t>
+        <w:t>c) En el caso de que ambos algoritmos sean de ordenación interna, enumere situaciones donde sería válido usar el algoritmo cuadrático.</w:t>
       </w:r>
     </w:p>
     <w:p>
@@ -1222,7 +1210,27 @@
           <w:szCs w:val="24"/>
           <w:lang w:val="es-ES"/>
         </w:rPr>
-        <w:t>En donde la cantidad de elementos a ordenar sea menor a 100, y en donde los ciclos aninados ejecuten instrucciones de corto tiempo de ejecución.</w:t>
+        <w:t xml:space="preserve">En donde la cantidad de elementos a ordenar sea menor a 100, y en donde los ciclos </w:t>
+      </w:r>
+      <w:proofErr w:type="spellStart"/>
+      <w:r>
+        <w:rPr>
+          <w:rFonts w:ascii="Arial" w:hAnsi="Arial" w:cs="Arial"/>
+          <w:sz w:val="24"/>
+          <w:szCs w:val="24"/>
+          <w:lang w:val="es-ES"/>
+        </w:rPr>
+        <w:t>aninados</w:t>
+      </w:r>
+      <w:proofErr w:type="spellEnd"/>
+      <w:r>
+        <w:rPr>
+          <w:rFonts w:ascii="Arial" w:hAnsi="Arial" w:cs="Arial"/>
+          <w:sz w:val="24"/>
+          <w:szCs w:val="24"/>
+          <w:lang w:val="es-ES"/>
+        </w:rPr>
+        <w:t xml:space="preserve"> ejecuten instrucciones de corto tiempo de ejecución.</w:t>
       </w:r>
     </w:p>
     <w:p>
@@ -1257,7 +1265,43 @@
           <w:sz w:val="24"/>
           <w:szCs w:val="24"/>
         </w:rPr>
-        <w:t xml:space="preserve">5) Sea la siguiente tabla: </w:t>
+        <w:t xml:space="preserve">5) Sea la </w:t>
+      </w:r>
+      <w:proofErr w:type="spellStart"/>
+      <w:r>
+        <w:rPr>
+          <w:rFonts w:ascii="Arial" w:hAnsi="Arial" w:cs="Arial"/>
+          <w:sz w:val="24"/>
+          <w:szCs w:val="24"/>
+        </w:rPr>
+        <w:t>siguiente</w:t>
+      </w:r>
+      <w:proofErr w:type="spellEnd"/>
+      <w:r>
+        <w:rPr>
+          <w:rFonts w:ascii="Arial" w:hAnsi="Arial" w:cs="Arial"/>
+          <w:sz w:val="24"/>
+          <w:szCs w:val="24"/>
+        </w:rPr>
+        <w:t xml:space="preserve"> </w:t>
+      </w:r>
+      <w:proofErr w:type="spellStart"/>
+      <w:r>
+        <w:rPr>
+          <w:rFonts w:ascii="Arial" w:hAnsi="Arial" w:cs="Arial"/>
+          <w:sz w:val="24"/>
+          <w:szCs w:val="24"/>
+        </w:rPr>
+        <w:t>tabla</w:t>
+      </w:r>
+      <w:proofErr w:type="spellEnd"/>
+      <w:r>
+        <w:rPr>
+          <w:rFonts w:ascii="Arial" w:hAnsi="Arial" w:cs="Arial"/>
+          <w:sz w:val="24"/>
+          <w:szCs w:val="24"/>
+        </w:rPr>
+        <w:t xml:space="preserve">: </w:t>
       </w:r>
       <w:r>
         <w:rPr>
@@ -1288,12 +1332,6 @@
         <w:gridCol w:w="2340"/>
       </w:tblGrid>
       <w:tr>
-        <w:tblPrEx>
-          <w:tblCellMar>
-            <w:top w:w="0" w:type="dxa"/>
-            <w:bottom w:w="0" w:type="dxa"/>
-          </w:tblCellMar>
-        </w:tblPrEx>
         <w:trPr>
           <w:trHeight w:val="575"/>
         </w:trPr>
@@ -1520,25 +1558,30 @@
                 <w:szCs w:val="24"/>
               </w:rPr>
             </w:pPr>
-            <w:r>
-              <w:rPr>
-                <w:rFonts w:ascii="Arial" w:hAnsi="Arial" w:cs="Arial"/>
-                <w:color w:val="000000"/>
-                <w:sz w:val="24"/>
-                <w:szCs w:val="24"/>
-              </w:rPr>
-              <w:t xml:space="preserve">Incremento </w:t>
+            <w:proofErr w:type="spellStart"/>
+            <w:r>
+              <w:rPr>
+                <w:rFonts w:ascii="Arial" w:hAnsi="Arial" w:cs="Arial"/>
+                <w:color w:val="000000"/>
+                <w:sz w:val="24"/>
+                <w:szCs w:val="24"/>
+              </w:rPr>
+              <w:t>Incremento</w:t>
+            </w:r>
+            <w:proofErr w:type="spellEnd"/>
+            <w:r>
+              <w:rPr>
+                <w:rFonts w:ascii="Arial" w:hAnsi="Arial" w:cs="Arial"/>
+                <w:color w:val="000000"/>
+                <w:sz w:val="24"/>
+                <w:szCs w:val="24"/>
+              </w:rPr>
+              <w:t xml:space="preserve"> </w:t>
             </w:r>
           </w:p>
         </w:tc>
       </w:tr>
       <w:tr>
-        <w:tblPrEx>
-          <w:tblCellMar>
-            <w:top w:w="0" w:type="dxa"/>
-            <w:bottom w:w="0" w:type="dxa"/>
-          </w:tblCellMar>
-        </w:tblPrEx>
         <w:trPr>
           <w:trHeight w:val="161"/>
         </w:trPr>
@@ -1680,12 +1723,6 @@
         </w:tc>
       </w:tr>
       <w:tr>
-        <w:tblPrEx>
-          <w:tblCellMar>
-            <w:top w:w="0" w:type="dxa"/>
-            <w:bottom w:w="0" w:type="dxa"/>
-          </w:tblCellMar>
-        </w:tblPrEx>
         <w:trPr>
           <w:trHeight w:val="164"/>
         </w:trPr>
@@ -1846,12 +1883,6 @@
         </w:tc>
       </w:tr>
       <w:tr>
-        <w:tblPrEx>
-          <w:tblCellMar>
-            <w:top w:w="0" w:type="dxa"/>
-            <w:bottom w:w="0" w:type="dxa"/>
-          </w:tblCellMar>
-        </w:tblPrEx>
         <w:trPr>
           <w:trHeight w:val="164"/>
         </w:trPr>
@@ -2012,12 +2043,6 @@
         </w:tc>
       </w:tr>
       <w:tr>
-        <w:tblPrEx>
-          <w:tblCellMar>
-            <w:top w:w="0" w:type="dxa"/>
-            <w:bottom w:w="0" w:type="dxa"/>
-          </w:tblCellMar>
-        </w:tblPrEx>
         <w:trPr>
           <w:trHeight w:val="164"/>
         </w:trPr>
@@ -2317,8 +2342,1602 @@
         </w:rPr>
         <w:t xml:space="preserve"> las discrepancias entre los tamaños empiezan a notarse fuertemente.</w:t>
       </w:r>
-      <w:bookmarkStart w:id="0" w:name="_GoBack"/>
-      <w:bookmarkEnd w:id="0"/>
+    </w:p>
+    <w:tbl>
+      <w:tblPr>
+        <w:tblpPr w:leftFromText="141" w:rightFromText="141" w:vertAnchor="text" w:horzAnchor="page" w:tblpX="2566" w:tblpY="86"/>
+        <w:tblW w:w="0" w:type="auto"/>
+        <w:tblCellMar>
+          <w:top w:w="15" w:type="dxa"/>
+          <w:left w:w="15" w:type="dxa"/>
+          <w:bottom w:w="15" w:type="dxa"/>
+          <w:right w:w="15" w:type="dxa"/>
+        </w:tblCellMar>
+        <w:tblLook w:val="04A0" w:firstRow="1" w:lastRow="0" w:firstColumn="1" w:lastColumn="0" w:noHBand="0" w:noVBand="1"/>
+      </w:tblPr>
+      <w:tblGrid>
+        <w:gridCol w:w="620"/>
+        <w:gridCol w:w="403"/>
+        <w:gridCol w:w="2555"/>
+        <w:gridCol w:w="1586"/>
+      </w:tblGrid>
+      <w:tr>
+        <w:tc>
+          <w:tcPr>
+            <w:tcW w:w="0" w:type="auto"/>
+            <w:tcBorders>
+              <w:top w:val="single" w:sz="4" w:space="0" w:color="000000"/>
+              <w:left w:val="single" w:sz="4" w:space="0" w:color="000000"/>
+              <w:bottom w:val="single" w:sz="4" w:space="0" w:color="000000"/>
+              <w:right w:val="single" w:sz="4" w:space="0" w:color="000000"/>
+            </w:tcBorders>
+            <w:tcMar>
+              <w:top w:w="0" w:type="dxa"/>
+              <w:left w:w="70" w:type="dxa"/>
+              <w:bottom w:w="0" w:type="dxa"/>
+              <w:right w:w="70" w:type="dxa"/>
+            </w:tcMar>
+            <w:hideMark/>
+          </w:tcPr>
+          <w:p>
+            <w:pPr>
+              <w:spacing w:after="0" w:line="240" w:lineRule="auto"/>
+              <w:rPr>
+                <w:rFonts w:ascii="Arial" w:eastAsia="Times New Roman" w:hAnsi="Arial" w:cs="Arial"/>
+                <w:sz w:val="24"/>
+                <w:szCs w:val="24"/>
+                <w:lang w:val="es-AR" w:eastAsia="es-AR"/>
+              </w:rPr>
+            </w:pPr>
+          </w:p>
+          <w:p>
+            <w:pPr>
+              <w:spacing w:after="0" w:line="240" w:lineRule="auto"/>
+              <w:rPr>
+                <w:rFonts w:ascii="Arial" w:eastAsia="Times New Roman" w:hAnsi="Arial" w:cs="Arial"/>
+                <w:sz w:val="24"/>
+                <w:szCs w:val="24"/>
+                <w:lang w:val="es-AR" w:eastAsia="es-AR"/>
+              </w:rPr>
+            </w:pPr>
+            <w:r>
+              <w:rPr>
+                <w:rFonts w:ascii="Arial" w:eastAsia="Times New Roman" w:hAnsi="Arial" w:cs="Arial"/>
+                <w:color w:val="000000"/>
+                <w:sz w:val="24"/>
+                <w:szCs w:val="24"/>
+                <w:lang w:val="es-AR" w:eastAsia="es-AR"/>
+              </w:rPr>
+              <w:t>O(n)</w:t>
+            </w:r>
+          </w:p>
+        </w:tc>
+        <w:tc>
+          <w:tcPr>
+            <w:tcW w:w="0" w:type="auto"/>
+            <w:tcBorders>
+              <w:top w:val="single" w:sz="4" w:space="0" w:color="000000"/>
+              <w:left w:val="single" w:sz="4" w:space="0" w:color="000000"/>
+              <w:bottom w:val="single" w:sz="4" w:space="0" w:color="000000"/>
+              <w:right w:val="single" w:sz="4" w:space="0" w:color="000000"/>
+            </w:tcBorders>
+            <w:tcMar>
+              <w:top w:w="0" w:type="dxa"/>
+              <w:left w:w="70" w:type="dxa"/>
+              <w:bottom w:w="0" w:type="dxa"/>
+              <w:right w:w="70" w:type="dxa"/>
+            </w:tcMar>
+            <w:hideMark/>
+          </w:tcPr>
+          <w:p>
+            <w:pPr>
+              <w:spacing w:after="0" w:line="240" w:lineRule="auto"/>
+              <w:rPr>
+                <w:rFonts w:ascii="Arial" w:eastAsia="Times New Roman" w:hAnsi="Arial" w:cs="Arial"/>
+                <w:sz w:val="24"/>
+                <w:szCs w:val="24"/>
+                <w:lang w:val="es-AR" w:eastAsia="es-AR"/>
+              </w:rPr>
+            </w:pPr>
+            <w:r>
+              <w:rPr>
+                <w:rFonts w:ascii="Arial" w:eastAsia="Times New Roman" w:hAnsi="Arial" w:cs="Arial"/>
+                <w:color w:val="000000"/>
+                <w:sz w:val="24"/>
+                <w:szCs w:val="24"/>
+                <w:lang w:val="es-AR" w:eastAsia="es-AR"/>
+              </w:rPr>
+              <w:t>1</w:t>
+            </w:r>
+          </w:p>
+        </w:tc>
+        <w:tc>
+          <w:tcPr>
+            <w:tcW w:w="0" w:type="auto"/>
+            <w:tcBorders>
+              <w:top w:val="single" w:sz="4" w:space="0" w:color="000000"/>
+              <w:left w:val="single" w:sz="4" w:space="0" w:color="000000"/>
+              <w:bottom w:val="single" w:sz="4" w:space="0" w:color="000000"/>
+              <w:right w:val="single" w:sz="4" w:space="0" w:color="000000"/>
+            </w:tcBorders>
+            <w:tcMar>
+              <w:top w:w="0" w:type="dxa"/>
+              <w:left w:w="70" w:type="dxa"/>
+              <w:bottom w:w="0" w:type="dxa"/>
+              <w:right w:w="70" w:type="dxa"/>
+            </w:tcMar>
+            <w:hideMark/>
+          </w:tcPr>
+          <w:p>
+            <w:pPr>
+              <w:spacing w:after="0" w:line="240" w:lineRule="auto"/>
+              <w:rPr>
+                <w:rFonts w:ascii="Arial" w:eastAsia="Times New Roman" w:hAnsi="Arial" w:cs="Arial"/>
+                <w:sz w:val="24"/>
+                <w:szCs w:val="24"/>
+                <w:lang w:val="es-AR" w:eastAsia="es-AR"/>
+              </w:rPr>
+            </w:pPr>
+            <w:r>
+              <w:rPr>
+                <w:rFonts w:ascii="Arial" w:eastAsia="Times New Roman" w:hAnsi="Arial" w:cs="Arial"/>
+                <w:color w:val="000000"/>
+                <w:sz w:val="24"/>
+                <w:szCs w:val="24"/>
+                <w:lang w:val="es-AR" w:eastAsia="es-AR"/>
+              </w:rPr>
+              <w:t>100  veces más rápido</w:t>
+            </w:r>
+          </w:p>
+        </w:tc>
+        <w:tc>
+          <w:tcPr>
+            <w:tcW w:w="0" w:type="auto"/>
+            <w:tcBorders>
+              <w:top w:val="single" w:sz="4" w:space="0" w:color="000000"/>
+              <w:left w:val="single" w:sz="4" w:space="0" w:color="000000"/>
+              <w:bottom w:val="single" w:sz="4" w:space="0" w:color="000000"/>
+              <w:right w:val="single" w:sz="4" w:space="0" w:color="000000"/>
+            </w:tcBorders>
+            <w:tcMar>
+              <w:top w:w="0" w:type="dxa"/>
+              <w:left w:w="70" w:type="dxa"/>
+              <w:bottom w:w="0" w:type="dxa"/>
+              <w:right w:w="70" w:type="dxa"/>
+            </w:tcMar>
+            <w:hideMark/>
+          </w:tcPr>
+          <w:p>
+            <w:pPr>
+              <w:spacing w:after="0" w:line="240" w:lineRule="auto"/>
+              <w:rPr>
+                <w:rFonts w:ascii="Arial" w:eastAsia="Times New Roman" w:hAnsi="Arial" w:cs="Arial"/>
+                <w:sz w:val="24"/>
+                <w:szCs w:val="24"/>
+                <w:lang w:val="es-AR" w:eastAsia="es-AR"/>
+              </w:rPr>
+            </w:pPr>
+            <w:r>
+              <w:rPr>
+                <w:rFonts w:ascii="Arial" w:eastAsia="Times New Roman" w:hAnsi="Arial" w:cs="Arial"/>
+                <w:color w:val="000000"/>
+                <w:sz w:val="24"/>
+                <w:szCs w:val="24"/>
+                <w:lang w:val="es-AR" w:eastAsia="es-AR"/>
+              </w:rPr>
+              <w:t>1000 veces</w:t>
+            </w:r>
+          </w:p>
+          <w:p>
+            <w:pPr>
+              <w:spacing w:after="0" w:line="240" w:lineRule="auto"/>
+              <w:rPr>
+                <w:rFonts w:ascii="Arial" w:eastAsia="Times New Roman" w:hAnsi="Arial" w:cs="Arial"/>
+                <w:sz w:val="24"/>
+                <w:szCs w:val="24"/>
+                <w:lang w:val="es-AR" w:eastAsia="es-AR"/>
+              </w:rPr>
+            </w:pPr>
+            <w:r>
+              <w:rPr>
+                <w:rFonts w:ascii="Arial" w:eastAsia="Times New Roman" w:hAnsi="Arial" w:cs="Arial"/>
+                <w:color w:val="000000"/>
+                <w:sz w:val="24"/>
+                <w:szCs w:val="24"/>
+                <w:lang w:val="es-AR" w:eastAsia="es-AR"/>
+              </w:rPr>
+              <w:t>más rápido</w:t>
+            </w:r>
+          </w:p>
+        </w:tc>
+      </w:tr>
+      <w:tr>
+        <w:tc>
+          <w:tcPr>
+            <w:tcW w:w="0" w:type="auto"/>
+            <w:tcBorders>
+              <w:top w:val="single" w:sz="4" w:space="0" w:color="000000"/>
+              <w:left w:val="single" w:sz="4" w:space="0" w:color="000000"/>
+              <w:bottom w:val="single" w:sz="4" w:space="0" w:color="000000"/>
+              <w:right w:val="single" w:sz="4" w:space="0" w:color="000000"/>
+            </w:tcBorders>
+            <w:tcMar>
+              <w:top w:w="0" w:type="dxa"/>
+              <w:left w:w="70" w:type="dxa"/>
+              <w:bottom w:w="0" w:type="dxa"/>
+              <w:right w:w="70" w:type="dxa"/>
+            </w:tcMar>
+            <w:hideMark/>
+          </w:tcPr>
+          <w:p>
+            <w:pPr>
+              <w:spacing w:after="0" w:line="240" w:lineRule="auto"/>
+              <w:rPr>
+                <w:rFonts w:ascii="Arial" w:eastAsia="Times New Roman" w:hAnsi="Arial" w:cs="Arial"/>
+                <w:sz w:val="24"/>
+                <w:szCs w:val="24"/>
+                <w:lang w:val="es-AR" w:eastAsia="es-AR"/>
+              </w:rPr>
+            </w:pPr>
+            <w:r>
+              <w:rPr>
+                <w:rFonts w:ascii="Arial" w:eastAsia="Times New Roman" w:hAnsi="Arial" w:cs="Arial"/>
+                <w:color w:val="000000"/>
+                <w:sz w:val="24"/>
+                <w:szCs w:val="24"/>
+                <w:lang w:val="es-AR" w:eastAsia="es-AR"/>
+              </w:rPr>
+              <w:t>n</w:t>
+            </w:r>
+          </w:p>
+        </w:tc>
+        <w:tc>
+          <w:tcPr>
+            <w:tcW w:w="0" w:type="auto"/>
+            <w:tcBorders>
+              <w:top w:val="single" w:sz="4" w:space="0" w:color="000000"/>
+              <w:left w:val="single" w:sz="4" w:space="0" w:color="000000"/>
+              <w:bottom w:val="single" w:sz="4" w:space="0" w:color="000000"/>
+              <w:right w:val="single" w:sz="4" w:space="0" w:color="000000"/>
+            </w:tcBorders>
+            <w:tcMar>
+              <w:top w:w="0" w:type="dxa"/>
+              <w:left w:w="70" w:type="dxa"/>
+              <w:bottom w:w="0" w:type="dxa"/>
+              <w:right w:w="70" w:type="dxa"/>
+            </w:tcMar>
+            <w:hideMark/>
+          </w:tcPr>
+          <w:p>
+            <w:pPr>
+              <w:spacing w:after="0" w:line="240" w:lineRule="auto"/>
+              <w:rPr>
+                <w:rFonts w:ascii="Arial" w:eastAsia="Times New Roman" w:hAnsi="Arial" w:cs="Arial"/>
+                <w:sz w:val="24"/>
+                <w:szCs w:val="24"/>
+                <w:lang w:val="es-AR" w:eastAsia="es-AR"/>
+              </w:rPr>
+            </w:pPr>
+            <w:r>
+              <w:rPr>
+                <w:rFonts w:ascii="Arial" w:eastAsia="Times New Roman" w:hAnsi="Arial" w:cs="Arial"/>
+                <w:color w:val="000000"/>
+                <w:sz w:val="24"/>
+                <w:szCs w:val="24"/>
+                <w:lang w:val="es-AR" w:eastAsia="es-AR"/>
+              </w:rPr>
+              <w:t>N</w:t>
+            </w:r>
+            <w:r>
+              <w:rPr>
+                <w:rFonts w:ascii="Arial" w:eastAsia="Times New Roman" w:hAnsi="Arial" w:cs="Arial"/>
+                <w:color w:val="000000"/>
+                <w:sz w:val="24"/>
+                <w:szCs w:val="24"/>
+                <w:vertAlign w:val="subscript"/>
+                <w:lang w:val="es-AR" w:eastAsia="es-AR"/>
+              </w:rPr>
+              <w:t>1</w:t>
+            </w:r>
+          </w:p>
+        </w:tc>
+        <w:tc>
+          <w:tcPr>
+            <w:tcW w:w="0" w:type="auto"/>
+            <w:tcBorders>
+              <w:top w:val="single" w:sz="4" w:space="0" w:color="000000"/>
+              <w:left w:val="single" w:sz="4" w:space="0" w:color="000000"/>
+              <w:bottom w:val="single" w:sz="4" w:space="0" w:color="000000"/>
+              <w:right w:val="single" w:sz="4" w:space="0" w:color="000000"/>
+            </w:tcBorders>
+            <w:tcMar>
+              <w:top w:w="0" w:type="dxa"/>
+              <w:left w:w="70" w:type="dxa"/>
+              <w:bottom w:w="0" w:type="dxa"/>
+              <w:right w:w="70" w:type="dxa"/>
+            </w:tcMar>
+            <w:hideMark/>
+          </w:tcPr>
+          <w:p>
+            <w:pPr>
+              <w:spacing w:after="0" w:line="240" w:lineRule="auto"/>
+              <w:jc w:val="center"/>
+              <w:rPr>
+                <w:rFonts w:ascii="Arial" w:eastAsia="Times New Roman" w:hAnsi="Arial" w:cs="Arial"/>
+                <w:sz w:val="24"/>
+                <w:szCs w:val="24"/>
+                <w:vertAlign w:val="subscript"/>
+                <w:lang w:val="es-AR" w:eastAsia="es-AR"/>
+              </w:rPr>
+            </w:pPr>
+            <w:r>
+              <w:rPr>
+                <w:rFonts w:ascii="Arial" w:eastAsia="Times New Roman" w:hAnsi="Arial" w:cs="Arial"/>
+                <w:sz w:val="24"/>
+                <w:szCs w:val="24"/>
+                <w:lang w:val="es-AR" w:eastAsia="es-AR"/>
+              </w:rPr>
+              <w:t>100</w:t>
+            </w:r>
+            <w:r>
+              <w:rPr>
+                <w:rFonts w:ascii="Arial" w:eastAsia="Times New Roman" w:hAnsi="Arial" w:cs="Arial"/>
+                <w:sz w:val="24"/>
+                <w:szCs w:val="24"/>
+                <w:lang w:val="es-AR" w:eastAsia="es-AR"/>
+              </w:rPr>
+              <w:t>N</w:t>
+            </w:r>
+            <w:r>
+              <w:rPr>
+                <w:rFonts w:ascii="Arial" w:eastAsia="Times New Roman" w:hAnsi="Arial" w:cs="Arial"/>
+                <w:sz w:val="24"/>
+                <w:szCs w:val="24"/>
+                <w:vertAlign w:val="subscript"/>
+                <w:lang w:val="es-AR" w:eastAsia="es-AR"/>
+              </w:rPr>
+              <w:t>1</w:t>
+            </w:r>
+          </w:p>
+        </w:tc>
+        <w:tc>
+          <w:tcPr>
+            <w:tcW w:w="0" w:type="auto"/>
+            <w:tcBorders>
+              <w:top w:val="single" w:sz="4" w:space="0" w:color="000000"/>
+              <w:left w:val="single" w:sz="4" w:space="0" w:color="000000"/>
+              <w:bottom w:val="single" w:sz="4" w:space="0" w:color="000000"/>
+              <w:right w:val="single" w:sz="4" w:space="0" w:color="000000"/>
+            </w:tcBorders>
+            <w:tcMar>
+              <w:top w:w="0" w:type="dxa"/>
+              <w:left w:w="70" w:type="dxa"/>
+              <w:bottom w:w="0" w:type="dxa"/>
+              <w:right w:w="70" w:type="dxa"/>
+            </w:tcMar>
+            <w:hideMark/>
+          </w:tcPr>
+          <w:p>
+            <w:pPr>
+              <w:spacing w:after="0" w:line="240" w:lineRule="auto"/>
+              <w:jc w:val="center"/>
+              <w:rPr>
+                <w:rFonts w:ascii="Arial" w:eastAsia="Times New Roman" w:hAnsi="Arial" w:cs="Arial"/>
+                <w:sz w:val="24"/>
+                <w:szCs w:val="24"/>
+                <w:vertAlign w:val="subscript"/>
+                <w:lang w:val="es-AR" w:eastAsia="es-AR"/>
+              </w:rPr>
+            </w:pPr>
+            <w:r>
+              <w:rPr>
+                <w:rFonts w:ascii="Arial" w:eastAsia="Times New Roman" w:hAnsi="Arial" w:cs="Arial"/>
+                <w:sz w:val="24"/>
+                <w:szCs w:val="24"/>
+                <w:lang w:val="es-AR" w:eastAsia="es-AR"/>
+              </w:rPr>
+              <w:t>1000</w:t>
+            </w:r>
+            <w:r>
+              <w:rPr>
+                <w:rFonts w:ascii="Arial" w:eastAsia="Times New Roman" w:hAnsi="Arial" w:cs="Arial"/>
+                <w:sz w:val="24"/>
+                <w:szCs w:val="24"/>
+                <w:lang w:val="es-AR" w:eastAsia="es-AR"/>
+              </w:rPr>
+              <w:t>N</w:t>
+            </w:r>
+            <w:r>
+              <w:rPr>
+                <w:rFonts w:ascii="Arial" w:eastAsia="Times New Roman" w:hAnsi="Arial" w:cs="Arial"/>
+                <w:sz w:val="24"/>
+                <w:szCs w:val="24"/>
+                <w:vertAlign w:val="subscript"/>
+                <w:lang w:val="es-AR" w:eastAsia="es-AR"/>
+              </w:rPr>
+              <w:t>1</w:t>
+            </w:r>
+          </w:p>
+        </w:tc>
+      </w:tr>
+      <w:tr>
+        <w:tc>
+          <w:tcPr>
+            <w:tcW w:w="0" w:type="auto"/>
+            <w:tcBorders>
+              <w:top w:val="single" w:sz="4" w:space="0" w:color="000000"/>
+              <w:left w:val="single" w:sz="4" w:space="0" w:color="000000"/>
+              <w:bottom w:val="single" w:sz="4" w:space="0" w:color="000000"/>
+              <w:right w:val="single" w:sz="4" w:space="0" w:color="000000"/>
+            </w:tcBorders>
+            <w:tcMar>
+              <w:top w:w="0" w:type="dxa"/>
+              <w:left w:w="70" w:type="dxa"/>
+              <w:bottom w:w="0" w:type="dxa"/>
+              <w:right w:w="70" w:type="dxa"/>
+            </w:tcMar>
+            <w:hideMark/>
+          </w:tcPr>
+          <w:p>
+            <w:pPr>
+              <w:spacing w:after="0" w:line="240" w:lineRule="auto"/>
+              <w:rPr>
+                <w:rFonts w:ascii="Arial" w:eastAsia="Times New Roman" w:hAnsi="Arial" w:cs="Arial"/>
+                <w:sz w:val="24"/>
+                <w:szCs w:val="24"/>
+                <w:lang w:val="es-AR" w:eastAsia="es-AR"/>
+              </w:rPr>
+            </w:pPr>
+            <w:r>
+              <w:rPr>
+                <w:rFonts w:ascii="Arial" w:eastAsia="Times New Roman" w:hAnsi="Arial" w:cs="Arial"/>
+                <w:color w:val="000000"/>
+                <w:sz w:val="24"/>
+                <w:szCs w:val="24"/>
+                <w:lang w:val="es-AR" w:eastAsia="es-AR"/>
+              </w:rPr>
+              <w:t>n</w:t>
+            </w:r>
+            <w:r>
+              <w:rPr>
+                <w:rFonts w:ascii="Arial" w:eastAsia="Times New Roman" w:hAnsi="Arial" w:cs="Arial"/>
+                <w:color w:val="000000"/>
+                <w:sz w:val="24"/>
+                <w:szCs w:val="24"/>
+                <w:vertAlign w:val="superscript"/>
+                <w:lang w:val="es-AR" w:eastAsia="es-AR"/>
+              </w:rPr>
+              <w:t>2</w:t>
+            </w:r>
+          </w:p>
+        </w:tc>
+        <w:tc>
+          <w:tcPr>
+            <w:tcW w:w="0" w:type="auto"/>
+            <w:tcBorders>
+              <w:top w:val="single" w:sz="4" w:space="0" w:color="000000"/>
+              <w:left w:val="single" w:sz="4" w:space="0" w:color="000000"/>
+              <w:bottom w:val="single" w:sz="4" w:space="0" w:color="000000"/>
+              <w:right w:val="single" w:sz="4" w:space="0" w:color="000000"/>
+            </w:tcBorders>
+            <w:tcMar>
+              <w:top w:w="0" w:type="dxa"/>
+              <w:left w:w="70" w:type="dxa"/>
+              <w:bottom w:w="0" w:type="dxa"/>
+              <w:right w:w="70" w:type="dxa"/>
+            </w:tcMar>
+            <w:hideMark/>
+          </w:tcPr>
+          <w:p>
+            <w:pPr>
+              <w:spacing w:after="0" w:line="240" w:lineRule="auto"/>
+              <w:rPr>
+                <w:rFonts w:ascii="Arial" w:eastAsia="Times New Roman" w:hAnsi="Arial" w:cs="Arial"/>
+                <w:sz w:val="24"/>
+                <w:szCs w:val="24"/>
+                <w:lang w:val="es-AR" w:eastAsia="es-AR"/>
+              </w:rPr>
+            </w:pPr>
+            <w:r>
+              <w:rPr>
+                <w:rFonts w:ascii="Arial" w:eastAsia="Times New Roman" w:hAnsi="Arial" w:cs="Arial"/>
+                <w:color w:val="000000"/>
+                <w:sz w:val="24"/>
+                <w:szCs w:val="24"/>
+                <w:lang w:val="es-AR" w:eastAsia="es-AR"/>
+              </w:rPr>
+              <w:t>N</w:t>
+            </w:r>
+            <w:r>
+              <w:rPr>
+                <w:rFonts w:ascii="Arial" w:eastAsia="Times New Roman" w:hAnsi="Arial" w:cs="Arial"/>
+                <w:color w:val="000000"/>
+                <w:sz w:val="24"/>
+                <w:szCs w:val="24"/>
+                <w:vertAlign w:val="subscript"/>
+                <w:lang w:val="es-AR" w:eastAsia="es-AR"/>
+              </w:rPr>
+              <w:t>2</w:t>
+            </w:r>
+          </w:p>
+        </w:tc>
+        <w:tc>
+          <w:tcPr>
+            <w:tcW w:w="0" w:type="auto"/>
+            <w:tcBorders>
+              <w:top w:val="single" w:sz="4" w:space="0" w:color="000000"/>
+              <w:left w:val="single" w:sz="4" w:space="0" w:color="000000"/>
+              <w:bottom w:val="single" w:sz="4" w:space="0" w:color="000000"/>
+              <w:right w:val="single" w:sz="4" w:space="0" w:color="000000"/>
+            </w:tcBorders>
+            <w:tcMar>
+              <w:top w:w="0" w:type="dxa"/>
+              <w:left w:w="70" w:type="dxa"/>
+              <w:bottom w:w="0" w:type="dxa"/>
+              <w:right w:w="70" w:type="dxa"/>
+            </w:tcMar>
+            <w:hideMark/>
+          </w:tcPr>
+          <w:p>
+            <w:pPr>
+              <w:spacing w:after="0" w:line="240" w:lineRule="auto"/>
+              <w:jc w:val="center"/>
+              <w:rPr>
+                <w:rFonts w:ascii="Arial" w:eastAsia="Times New Roman" w:hAnsi="Arial" w:cs="Arial"/>
+                <w:sz w:val="24"/>
+                <w:szCs w:val="24"/>
+                <w:vertAlign w:val="subscript"/>
+                <w:lang w:val="es-AR" w:eastAsia="es-AR"/>
+              </w:rPr>
+            </w:pPr>
+            <w:r>
+              <w:rPr>
+                <w:rFonts w:ascii="Arial" w:eastAsia="Times New Roman" w:hAnsi="Arial" w:cs="Arial"/>
+                <w:sz w:val="24"/>
+                <w:szCs w:val="24"/>
+                <w:lang w:val="es-AR" w:eastAsia="es-AR"/>
+              </w:rPr>
+              <w:t>10</w:t>
+            </w:r>
+            <w:r>
+              <w:rPr>
+                <w:rFonts w:ascii="Arial" w:eastAsia="Times New Roman" w:hAnsi="Arial" w:cs="Arial"/>
+                <w:sz w:val="24"/>
+                <w:szCs w:val="24"/>
+                <w:lang w:val="es-AR" w:eastAsia="es-AR"/>
+              </w:rPr>
+              <w:t>N</w:t>
+            </w:r>
+            <w:r>
+              <w:rPr>
+                <w:rFonts w:ascii="Arial" w:eastAsia="Times New Roman" w:hAnsi="Arial" w:cs="Arial"/>
+                <w:sz w:val="24"/>
+                <w:szCs w:val="24"/>
+                <w:vertAlign w:val="subscript"/>
+                <w:lang w:val="es-AR" w:eastAsia="es-AR"/>
+              </w:rPr>
+              <w:t>2</w:t>
+            </w:r>
+          </w:p>
+        </w:tc>
+        <w:tc>
+          <w:tcPr>
+            <w:tcW w:w="0" w:type="auto"/>
+            <w:tcBorders>
+              <w:top w:val="single" w:sz="4" w:space="0" w:color="000000"/>
+              <w:left w:val="single" w:sz="4" w:space="0" w:color="000000"/>
+              <w:bottom w:val="single" w:sz="4" w:space="0" w:color="000000"/>
+              <w:right w:val="single" w:sz="4" w:space="0" w:color="000000"/>
+            </w:tcBorders>
+            <w:tcMar>
+              <w:top w:w="0" w:type="dxa"/>
+              <w:left w:w="70" w:type="dxa"/>
+              <w:bottom w:w="0" w:type="dxa"/>
+              <w:right w:w="70" w:type="dxa"/>
+            </w:tcMar>
+            <w:hideMark/>
+          </w:tcPr>
+          <w:p>
+            <w:pPr>
+              <w:spacing w:after="0" w:line="240" w:lineRule="auto"/>
+              <w:jc w:val="center"/>
+              <w:rPr>
+                <w:rFonts w:ascii="Arial" w:eastAsia="Times New Roman" w:hAnsi="Arial" w:cs="Arial"/>
+                <w:sz w:val="24"/>
+                <w:szCs w:val="24"/>
+                <w:vertAlign w:val="subscript"/>
+                <w:lang w:val="es-AR" w:eastAsia="es-AR"/>
+              </w:rPr>
+            </w:pPr>
+            <w:r>
+              <w:rPr>
+                <w:rFonts w:ascii="Arial" w:eastAsia="Times New Roman" w:hAnsi="Arial" w:cs="Arial"/>
+                <w:sz w:val="24"/>
+                <w:szCs w:val="24"/>
+                <w:lang w:val="es-AR" w:eastAsia="es-AR"/>
+              </w:rPr>
+              <w:t>31.6</w:t>
+            </w:r>
+            <w:r>
+              <w:rPr>
+                <w:rFonts w:ascii="Arial" w:eastAsia="Times New Roman" w:hAnsi="Arial" w:cs="Arial"/>
+                <w:sz w:val="24"/>
+                <w:szCs w:val="24"/>
+                <w:lang w:val="es-AR" w:eastAsia="es-AR"/>
+              </w:rPr>
+              <w:t>N</w:t>
+            </w:r>
+            <w:r>
+              <w:rPr>
+                <w:rFonts w:ascii="Arial" w:eastAsia="Times New Roman" w:hAnsi="Arial" w:cs="Arial"/>
+                <w:sz w:val="24"/>
+                <w:szCs w:val="24"/>
+                <w:vertAlign w:val="subscript"/>
+                <w:lang w:val="es-AR" w:eastAsia="es-AR"/>
+              </w:rPr>
+              <w:t>2</w:t>
+            </w:r>
+          </w:p>
+        </w:tc>
+      </w:tr>
+      <w:tr>
+        <w:tc>
+          <w:tcPr>
+            <w:tcW w:w="0" w:type="auto"/>
+            <w:tcBorders>
+              <w:top w:val="single" w:sz="4" w:space="0" w:color="000000"/>
+              <w:left w:val="single" w:sz="4" w:space="0" w:color="000000"/>
+              <w:bottom w:val="single" w:sz="4" w:space="0" w:color="000000"/>
+              <w:right w:val="single" w:sz="4" w:space="0" w:color="000000"/>
+            </w:tcBorders>
+            <w:tcMar>
+              <w:top w:w="0" w:type="dxa"/>
+              <w:left w:w="70" w:type="dxa"/>
+              <w:bottom w:w="0" w:type="dxa"/>
+              <w:right w:w="70" w:type="dxa"/>
+            </w:tcMar>
+            <w:hideMark/>
+          </w:tcPr>
+          <w:p>
+            <w:pPr>
+              <w:spacing w:after="0" w:line="240" w:lineRule="auto"/>
+              <w:rPr>
+                <w:rFonts w:ascii="Arial" w:eastAsia="Times New Roman" w:hAnsi="Arial" w:cs="Arial"/>
+                <w:sz w:val="24"/>
+                <w:szCs w:val="24"/>
+                <w:lang w:val="es-AR" w:eastAsia="es-AR"/>
+              </w:rPr>
+            </w:pPr>
+            <w:r>
+              <w:rPr>
+                <w:rFonts w:ascii="Arial" w:eastAsia="Times New Roman" w:hAnsi="Arial" w:cs="Arial"/>
+                <w:color w:val="000000"/>
+                <w:sz w:val="24"/>
+                <w:szCs w:val="24"/>
+                <w:lang w:val="es-AR" w:eastAsia="es-AR"/>
+              </w:rPr>
+              <w:t>n</w:t>
+            </w:r>
+            <w:r>
+              <w:rPr>
+                <w:rFonts w:ascii="Arial" w:eastAsia="Times New Roman" w:hAnsi="Arial" w:cs="Arial"/>
+                <w:color w:val="000000"/>
+                <w:sz w:val="24"/>
+                <w:szCs w:val="24"/>
+                <w:vertAlign w:val="superscript"/>
+                <w:lang w:val="es-AR" w:eastAsia="es-AR"/>
+              </w:rPr>
+              <w:t>3</w:t>
+            </w:r>
+          </w:p>
+        </w:tc>
+        <w:tc>
+          <w:tcPr>
+            <w:tcW w:w="0" w:type="auto"/>
+            <w:tcBorders>
+              <w:top w:val="single" w:sz="4" w:space="0" w:color="000000"/>
+              <w:left w:val="single" w:sz="4" w:space="0" w:color="000000"/>
+              <w:bottom w:val="single" w:sz="4" w:space="0" w:color="000000"/>
+              <w:right w:val="single" w:sz="4" w:space="0" w:color="000000"/>
+            </w:tcBorders>
+            <w:tcMar>
+              <w:top w:w="0" w:type="dxa"/>
+              <w:left w:w="70" w:type="dxa"/>
+              <w:bottom w:w="0" w:type="dxa"/>
+              <w:right w:w="70" w:type="dxa"/>
+            </w:tcMar>
+            <w:hideMark/>
+          </w:tcPr>
+          <w:p>
+            <w:pPr>
+              <w:spacing w:after="0" w:line="240" w:lineRule="auto"/>
+              <w:rPr>
+                <w:rFonts w:ascii="Arial" w:eastAsia="Times New Roman" w:hAnsi="Arial" w:cs="Arial"/>
+                <w:sz w:val="24"/>
+                <w:szCs w:val="24"/>
+                <w:lang w:val="es-AR" w:eastAsia="es-AR"/>
+              </w:rPr>
+            </w:pPr>
+            <w:r>
+              <w:rPr>
+                <w:rFonts w:ascii="Arial" w:eastAsia="Times New Roman" w:hAnsi="Arial" w:cs="Arial"/>
+                <w:color w:val="000000"/>
+                <w:sz w:val="24"/>
+                <w:szCs w:val="24"/>
+                <w:lang w:val="es-AR" w:eastAsia="es-AR"/>
+              </w:rPr>
+              <w:t>N</w:t>
+            </w:r>
+            <w:r>
+              <w:rPr>
+                <w:rFonts w:ascii="Arial" w:eastAsia="Times New Roman" w:hAnsi="Arial" w:cs="Arial"/>
+                <w:color w:val="000000"/>
+                <w:sz w:val="24"/>
+                <w:szCs w:val="24"/>
+                <w:vertAlign w:val="subscript"/>
+                <w:lang w:val="es-AR" w:eastAsia="es-AR"/>
+              </w:rPr>
+              <w:t>3</w:t>
+            </w:r>
+          </w:p>
+        </w:tc>
+        <w:tc>
+          <w:tcPr>
+            <w:tcW w:w="0" w:type="auto"/>
+            <w:tcBorders>
+              <w:top w:val="single" w:sz="4" w:space="0" w:color="000000"/>
+              <w:left w:val="single" w:sz="4" w:space="0" w:color="000000"/>
+              <w:bottom w:val="single" w:sz="4" w:space="0" w:color="000000"/>
+              <w:right w:val="single" w:sz="4" w:space="0" w:color="000000"/>
+            </w:tcBorders>
+            <w:tcMar>
+              <w:top w:w="0" w:type="dxa"/>
+              <w:left w:w="70" w:type="dxa"/>
+              <w:bottom w:w="0" w:type="dxa"/>
+              <w:right w:w="70" w:type="dxa"/>
+            </w:tcMar>
+            <w:hideMark/>
+          </w:tcPr>
+          <w:p>
+            <w:pPr>
+              <w:spacing w:after="0" w:line="240" w:lineRule="auto"/>
+              <w:jc w:val="center"/>
+              <w:rPr>
+                <w:rFonts w:ascii="Arial" w:eastAsia="Times New Roman" w:hAnsi="Arial" w:cs="Arial"/>
+                <w:sz w:val="24"/>
+                <w:szCs w:val="24"/>
+                <w:vertAlign w:val="subscript"/>
+                <w:lang w:val="es-AR" w:eastAsia="es-AR"/>
+              </w:rPr>
+            </w:pPr>
+            <w:r>
+              <w:rPr>
+                <w:rFonts w:ascii="Arial" w:eastAsia="Times New Roman" w:hAnsi="Arial" w:cs="Arial"/>
+                <w:sz w:val="24"/>
+                <w:szCs w:val="24"/>
+                <w:lang w:val="es-AR" w:eastAsia="es-AR"/>
+              </w:rPr>
+              <w:t>4.64N</w:t>
+            </w:r>
+            <w:r>
+              <w:rPr>
+                <w:rFonts w:ascii="Arial" w:eastAsia="Times New Roman" w:hAnsi="Arial" w:cs="Arial"/>
+                <w:sz w:val="24"/>
+                <w:szCs w:val="24"/>
+                <w:vertAlign w:val="subscript"/>
+                <w:lang w:val="es-AR" w:eastAsia="es-AR"/>
+              </w:rPr>
+              <w:t>3</w:t>
+            </w:r>
+          </w:p>
+        </w:tc>
+        <w:tc>
+          <w:tcPr>
+            <w:tcW w:w="0" w:type="auto"/>
+            <w:tcBorders>
+              <w:top w:val="single" w:sz="4" w:space="0" w:color="000000"/>
+              <w:left w:val="single" w:sz="4" w:space="0" w:color="000000"/>
+              <w:bottom w:val="single" w:sz="4" w:space="0" w:color="000000"/>
+              <w:right w:val="single" w:sz="4" w:space="0" w:color="000000"/>
+            </w:tcBorders>
+            <w:tcMar>
+              <w:top w:w="0" w:type="dxa"/>
+              <w:left w:w="70" w:type="dxa"/>
+              <w:bottom w:w="0" w:type="dxa"/>
+              <w:right w:w="70" w:type="dxa"/>
+            </w:tcMar>
+            <w:hideMark/>
+          </w:tcPr>
+          <w:p>
+            <w:pPr>
+              <w:spacing w:after="0" w:line="240" w:lineRule="auto"/>
+              <w:jc w:val="center"/>
+              <w:rPr>
+                <w:rFonts w:ascii="Arial" w:eastAsia="Times New Roman" w:hAnsi="Arial" w:cs="Arial"/>
+                <w:sz w:val="24"/>
+                <w:szCs w:val="24"/>
+                <w:lang w:val="es-AR" w:eastAsia="es-AR"/>
+              </w:rPr>
+            </w:pPr>
+            <w:r>
+              <w:rPr>
+                <w:rFonts w:ascii="Arial" w:eastAsia="Times New Roman" w:hAnsi="Arial" w:cs="Arial"/>
+                <w:sz w:val="24"/>
+                <w:szCs w:val="24"/>
+                <w:lang w:val="es-AR" w:eastAsia="es-AR"/>
+              </w:rPr>
+              <w:t>10N</w:t>
+            </w:r>
+            <w:r>
+              <w:rPr>
+                <w:rFonts w:ascii="Arial" w:eastAsia="Times New Roman" w:hAnsi="Arial" w:cs="Arial"/>
+                <w:sz w:val="24"/>
+                <w:szCs w:val="24"/>
+                <w:vertAlign w:val="subscript"/>
+                <w:lang w:val="es-AR" w:eastAsia="es-AR"/>
+              </w:rPr>
+              <w:t>3</w:t>
+            </w:r>
+          </w:p>
+        </w:tc>
+      </w:tr>
+      <w:tr>
+        <w:tc>
+          <w:tcPr>
+            <w:tcW w:w="0" w:type="auto"/>
+            <w:tcBorders>
+              <w:top w:val="single" w:sz="4" w:space="0" w:color="000000"/>
+              <w:left w:val="single" w:sz="4" w:space="0" w:color="000000"/>
+              <w:bottom w:val="single" w:sz="4" w:space="0" w:color="000000"/>
+              <w:right w:val="single" w:sz="4" w:space="0" w:color="000000"/>
+            </w:tcBorders>
+            <w:tcMar>
+              <w:top w:w="0" w:type="dxa"/>
+              <w:left w:w="70" w:type="dxa"/>
+              <w:bottom w:w="0" w:type="dxa"/>
+              <w:right w:w="70" w:type="dxa"/>
+            </w:tcMar>
+            <w:hideMark/>
+          </w:tcPr>
+          <w:p>
+            <w:pPr>
+              <w:spacing w:after="0" w:line="240" w:lineRule="auto"/>
+              <w:rPr>
+                <w:rFonts w:ascii="Arial" w:eastAsia="Times New Roman" w:hAnsi="Arial" w:cs="Arial"/>
+                <w:sz w:val="24"/>
+                <w:szCs w:val="24"/>
+                <w:lang w:val="es-AR" w:eastAsia="es-AR"/>
+              </w:rPr>
+            </w:pPr>
+            <w:r>
+              <w:rPr>
+                <w:rFonts w:ascii="Arial" w:eastAsia="Times New Roman" w:hAnsi="Arial" w:cs="Arial"/>
+                <w:color w:val="000000"/>
+                <w:sz w:val="24"/>
+                <w:szCs w:val="24"/>
+                <w:lang w:val="es-AR" w:eastAsia="es-AR"/>
+              </w:rPr>
+              <w:t>n</w:t>
+            </w:r>
+            <w:r>
+              <w:rPr>
+                <w:rFonts w:ascii="Arial" w:eastAsia="Times New Roman" w:hAnsi="Arial" w:cs="Arial"/>
+                <w:color w:val="000000"/>
+                <w:sz w:val="24"/>
+                <w:szCs w:val="24"/>
+                <w:vertAlign w:val="superscript"/>
+                <w:lang w:val="es-AR" w:eastAsia="es-AR"/>
+              </w:rPr>
+              <w:t>5</w:t>
+            </w:r>
+          </w:p>
+        </w:tc>
+        <w:tc>
+          <w:tcPr>
+            <w:tcW w:w="0" w:type="auto"/>
+            <w:tcBorders>
+              <w:top w:val="single" w:sz="4" w:space="0" w:color="000000"/>
+              <w:left w:val="single" w:sz="4" w:space="0" w:color="000000"/>
+              <w:bottom w:val="single" w:sz="4" w:space="0" w:color="000000"/>
+              <w:right w:val="single" w:sz="4" w:space="0" w:color="000000"/>
+            </w:tcBorders>
+            <w:tcMar>
+              <w:top w:w="0" w:type="dxa"/>
+              <w:left w:w="70" w:type="dxa"/>
+              <w:bottom w:w="0" w:type="dxa"/>
+              <w:right w:w="70" w:type="dxa"/>
+            </w:tcMar>
+            <w:hideMark/>
+          </w:tcPr>
+          <w:p>
+            <w:pPr>
+              <w:spacing w:after="0" w:line="240" w:lineRule="auto"/>
+              <w:rPr>
+                <w:rFonts w:ascii="Arial" w:eastAsia="Times New Roman" w:hAnsi="Arial" w:cs="Arial"/>
+                <w:sz w:val="24"/>
+                <w:szCs w:val="24"/>
+                <w:lang w:val="es-AR" w:eastAsia="es-AR"/>
+              </w:rPr>
+            </w:pPr>
+            <w:r>
+              <w:rPr>
+                <w:rFonts w:ascii="Arial" w:eastAsia="Times New Roman" w:hAnsi="Arial" w:cs="Arial"/>
+                <w:color w:val="000000"/>
+                <w:sz w:val="24"/>
+                <w:szCs w:val="24"/>
+                <w:lang w:val="es-AR" w:eastAsia="es-AR"/>
+              </w:rPr>
+              <w:t>N</w:t>
+            </w:r>
+            <w:r>
+              <w:rPr>
+                <w:rFonts w:ascii="Arial" w:eastAsia="Times New Roman" w:hAnsi="Arial" w:cs="Arial"/>
+                <w:color w:val="000000"/>
+                <w:sz w:val="24"/>
+                <w:szCs w:val="24"/>
+                <w:vertAlign w:val="subscript"/>
+                <w:lang w:val="es-AR" w:eastAsia="es-AR"/>
+              </w:rPr>
+              <w:t>4</w:t>
+            </w:r>
+          </w:p>
+        </w:tc>
+        <w:tc>
+          <w:tcPr>
+            <w:tcW w:w="0" w:type="auto"/>
+            <w:tcBorders>
+              <w:top w:val="single" w:sz="4" w:space="0" w:color="000000"/>
+              <w:left w:val="single" w:sz="4" w:space="0" w:color="000000"/>
+              <w:bottom w:val="single" w:sz="4" w:space="0" w:color="000000"/>
+              <w:right w:val="single" w:sz="4" w:space="0" w:color="000000"/>
+            </w:tcBorders>
+            <w:tcMar>
+              <w:top w:w="0" w:type="dxa"/>
+              <w:left w:w="70" w:type="dxa"/>
+              <w:bottom w:w="0" w:type="dxa"/>
+              <w:right w:w="70" w:type="dxa"/>
+            </w:tcMar>
+            <w:hideMark/>
+          </w:tcPr>
+          <w:p>
+            <w:pPr>
+              <w:spacing w:after="0" w:line="240" w:lineRule="auto"/>
+              <w:jc w:val="center"/>
+              <w:rPr>
+                <w:rFonts w:ascii="Arial" w:eastAsia="Times New Roman" w:hAnsi="Arial" w:cs="Arial"/>
+                <w:sz w:val="24"/>
+                <w:szCs w:val="24"/>
+                <w:lang w:val="es-AR" w:eastAsia="es-AR"/>
+              </w:rPr>
+            </w:pPr>
+            <w:r>
+              <w:rPr>
+                <w:rFonts w:ascii="Arial" w:eastAsia="Times New Roman" w:hAnsi="Arial" w:cs="Arial"/>
+                <w:sz w:val="24"/>
+                <w:szCs w:val="24"/>
+                <w:lang w:val="es-AR" w:eastAsia="es-AR"/>
+              </w:rPr>
+              <w:t>2.51N</w:t>
+            </w:r>
+            <w:r>
+              <w:rPr>
+                <w:rFonts w:ascii="Arial" w:eastAsia="Times New Roman" w:hAnsi="Arial" w:cs="Arial"/>
+                <w:sz w:val="24"/>
+                <w:szCs w:val="24"/>
+                <w:vertAlign w:val="subscript"/>
+                <w:lang w:val="es-AR" w:eastAsia="es-AR"/>
+              </w:rPr>
+              <w:t>4</w:t>
+            </w:r>
+          </w:p>
+        </w:tc>
+        <w:tc>
+          <w:tcPr>
+            <w:tcW w:w="0" w:type="auto"/>
+            <w:tcBorders>
+              <w:top w:val="single" w:sz="4" w:space="0" w:color="000000"/>
+              <w:left w:val="single" w:sz="4" w:space="0" w:color="000000"/>
+              <w:bottom w:val="single" w:sz="4" w:space="0" w:color="000000"/>
+              <w:right w:val="single" w:sz="4" w:space="0" w:color="000000"/>
+            </w:tcBorders>
+            <w:tcMar>
+              <w:top w:w="0" w:type="dxa"/>
+              <w:left w:w="70" w:type="dxa"/>
+              <w:bottom w:w="0" w:type="dxa"/>
+              <w:right w:w="70" w:type="dxa"/>
+            </w:tcMar>
+            <w:hideMark/>
+          </w:tcPr>
+          <w:p>
+            <w:pPr>
+              <w:spacing w:after="0" w:line="240" w:lineRule="auto"/>
+              <w:jc w:val="center"/>
+              <w:rPr>
+                <w:rFonts w:ascii="Arial" w:eastAsia="Times New Roman" w:hAnsi="Arial" w:cs="Arial"/>
+                <w:sz w:val="24"/>
+                <w:szCs w:val="24"/>
+                <w:vertAlign w:val="subscript"/>
+                <w:lang w:val="es-AR" w:eastAsia="es-AR"/>
+              </w:rPr>
+            </w:pPr>
+            <w:r>
+              <w:rPr>
+                <w:rFonts w:ascii="Arial" w:eastAsia="Times New Roman" w:hAnsi="Arial" w:cs="Arial"/>
+                <w:sz w:val="24"/>
+                <w:szCs w:val="24"/>
+                <w:lang w:val="es-AR" w:eastAsia="es-AR"/>
+              </w:rPr>
+              <w:t>3.98N</w:t>
+            </w:r>
+            <w:r>
+              <w:rPr>
+                <w:rFonts w:ascii="Arial" w:eastAsia="Times New Roman" w:hAnsi="Arial" w:cs="Arial"/>
+                <w:sz w:val="24"/>
+                <w:szCs w:val="24"/>
+                <w:vertAlign w:val="subscript"/>
+                <w:lang w:val="es-AR" w:eastAsia="es-AR"/>
+              </w:rPr>
+              <w:t>4</w:t>
+            </w:r>
+          </w:p>
+        </w:tc>
+      </w:tr>
+      <w:tr>
+        <w:tc>
+          <w:tcPr>
+            <w:tcW w:w="0" w:type="auto"/>
+            <w:tcBorders>
+              <w:top w:val="single" w:sz="4" w:space="0" w:color="000000"/>
+              <w:left w:val="single" w:sz="4" w:space="0" w:color="000000"/>
+              <w:bottom w:val="single" w:sz="4" w:space="0" w:color="000000"/>
+              <w:right w:val="single" w:sz="4" w:space="0" w:color="000000"/>
+            </w:tcBorders>
+            <w:tcMar>
+              <w:top w:w="0" w:type="dxa"/>
+              <w:left w:w="70" w:type="dxa"/>
+              <w:bottom w:w="0" w:type="dxa"/>
+              <w:right w:w="70" w:type="dxa"/>
+            </w:tcMar>
+            <w:hideMark/>
+          </w:tcPr>
+          <w:p>
+            <w:pPr>
+              <w:spacing w:after="0" w:line="240" w:lineRule="auto"/>
+              <w:rPr>
+                <w:rFonts w:ascii="Arial" w:eastAsia="Times New Roman" w:hAnsi="Arial" w:cs="Arial"/>
+                <w:sz w:val="24"/>
+                <w:szCs w:val="24"/>
+                <w:lang w:val="es-AR" w:eastAsia="es-AR"/>
+              </w:rPr>
+            </w:pPr>
+            <w:r>
+              <w:rPr>
+                <w:rFonts w:ascii="Arial" w:eastAsia="Times New Roman" w:hAnsi="Arial" w:cs="Arial"/>
+                <w:color w:val="000000"/>
+                <w:sz w:val="24"/>
+                <w:szCs w:val="24"/>
+                <w:lang w:val="es-AR" w:eastAsia="es-AR"/>
+              </w:rPr>
+              <w:t>2</w:t>
+            </w:r>
+            <w:r>
+              <w:rPr>
+                <w:rFonts w:ascii="Arial" w:eastAsia="Times New Roman" w:hAnsi="Arial" w:cs="Arial"/>
+                <w:color w:val="000000"/>
+                <w:sz w:val="24"/>
+                <w:szCs w:val="24"/>
+                <w:vertAlign w:val="superscript"/>
+                <w:lang w:val="es-AR" w:eastAsia="es-AR"/>
+              </w:rPr>
+              <w:t>n</w:t>
+            </w:r>
+          </w:p>
+        </w:tc>
+        <w:tc>
+          <w:tcPr>
+            <w:tcW w:w="0" w:type="auto"/>
+            <w:tcBorders>
+              <w:top w:val="single" w:sz="4" w:space="0" w:color="000000"/>
+              <w:left w:val="single" w:sz="4" w:space="0" w:color="000000"/>
+              <w:bottom w:val="single" w:sz="4" w:space="0" w:color="000000"/>
+              <w:right w:val="single" w:sz="4" w:space="0" w:color="000000"/>
+            </w:tcBorders>
+            <w:tcMar>
+              <w:top w:w="0" w:type="dxa"/>
+              <w:left w:w="70" w:type="dxa"/>
+              <w:bottom w:w="0" w:type="dxa"/>
+              <w:right w:w="70" w:type="dxa"/>
+            </w:tcMar>
+            <w:hideMark/>
+          </w:tcPr>
+          <w:p>
+            <w:pPr>
+              <w:spacing w:after="0" w:line="240" w:lineRule="auto"/>
+              <w:rPr>
+                <w:rFonts w:ascii="Arial" w:eastAsia="Times New Roman" w:hAnsi="Arial" w:cs="Arial"/>
+                <w:sz w:val="24"/>
+                <w:szCs w:val="24"/>
+                <w:lang w:val="es-AR" w:eastAsia="es-AR"/>
+              </w:rPr>
+            </w:pPr>
+            <w:r>
+              <w:rPr>
+                <w:rFonts w:ascii="Arial" w:eastAsia="Times New Roman" w:hAnsi="Arial" w:cs="Arial"/>
+                <w:color w:val="000000"/>
+                <w:sz w:val="24"/>
+                <w:szCs w:val="24"/>
+                <w:lang w:val="es-AR" w:eastAsia="es-AR"/>
+              </w:rPr>
+              <w:t>N</w:t>
+            </w:r>
+            <w:r>
+              <w:rPr>
+                <w:rFonts w:ascii="Arial" w:eastAsia="Times New Roman" w:hAnsi="Arial" w:cs="Arial"/>
+                <w:color w:val="000000"/>
+                <w:sz w:val="24"/>
+                <w:szCs w:val="24"/>
+                <w:vertAlign w:val="subscript"/>
+                <w:lang w:val="es-AR" w:eastAsia="es-AR"/>
+              </w:rPr>
+              <w:t>5</w:t>
+            </w:r>
+          </w:p>
+        </w:tc>
+        <w:tc>
+          <w:tcPr>
+            <w:tcW w:w="0" w:type="auto"/>
+            <w:tcBorders>
+              <w:top w:val="single" w:sz="4" w:space="0" w:color="000000"/>
+              <w:left w:val="single" w:sz="4" w:space="0" w:color="000000"/>
+              <w:bottom w:val="single" w:sz="4" w:space="0" w:color="000000"/>
+              <w:right w:val="single" w:sz="4" w:space="0" w:color="000000"/>
+            </w:tcBorders>
+            <w:tcMar>
+              <w:top w:w="0" w:type="dxa"/>
+              <w:left w:w="70" w:type="dxa"/>
+              <w:bottom w:w="0" w:type="dxa"/>
+              <w:right w:w="70" w:type="dxa"/>
+            </w:tcMar>
+            <w:hideMark/>
+          </w:tcPr>
+          <w:p>
+            <w:pPr>
+              <w:spacing w:after="0" w:line="240" w:lineRule="auto"/>
+              <w:jc w:val="center"/>
+              <w:rPr>
+                <w:rFonts w:ascii="Arial" w:eastAsia="Times New Roman" w:hAnsi="Arial" w:cs="Arial"/>
+                <w:sz w:val="24"/>
+                <w:szCs w:val="24"/>
+                <w:lang w:val="es-AR" w:eastAsia="es-AR"/>
+              </w:rPr>
+            </w:pPr>
+            <w:r>
+              <w:rPr>
+                <w:rFonts w:ascii="Arial" w:eastAsia="Times New Roman" w:hAnsi="Arial" w:cs="Arial"/>
+                <w:sz w:val="24"/>
+                <w:szCs w:val="24"/>
+                <w:lang w:val="es-AR" w:eastAsia="es-AR"/>
+              </w:rPr>
+              <w:t>Log</w:t>
+            </w:r>
+            <w:r>
+              <w:rPr>
+                <w:rFonts w:ascii="Arial" w:eastAsia="Times New Roman" w:hAnsi="Arial" w:cs="Arial"/>
+                <w:sz w:val="24"/>
+                <w:szCs w:val="24"/>
+                <w:vertAlign w:val="subscript"/>
+                <w:lang w:val="es-AR" w:eastAsia="es-AR"/>
+              </w:rPr>
+              <w:t>2</w:t>
+            </w:r>
+            <w:r>
+              <w:rPr>
+                <w:rFonts w:ascii="Arial" w:eastAsia="Times New Roman" w:hAnsi="Arial" w:cs="Arial"/>
+                <w:sz w:val="24"/>
+                <w:szCs w:val="24"/>
+                <w:lang w:val="es-AR" w:eastAsia="es-AR"/>
+              </w:rPr>
+              <w:t>(100N</w:t>
+            </w:r>
+            <w:r>
+              <w:rPr>
+                <w:rFonts w:ascii="Arial" w:eastAsia="Times New Roman" w:hAnsi="Arial" w:cs="Arial"/>
+                <w:sz w:val="24"/>
+                <w:szCs w:val="24"/>
+                <w:vertAlign w:val="subscript"/>
+                <w:lang w:val="es-AR" w:eastAsia="es-AR"/>
+              </w:rPr>
+              <w:t>5</w:t>
+            </w:r>
+            <w:r>
+              <w:rPr>
+                <w:rFonts w:ascii="Arial" w:eastAsia="Times New Roman" w:hAnsi="Arial" w:cs="Arial"/>
+                <w:sz w:val="24"/>
+                <w:szCs w:val="24"/>
+                <w:lang w:val="es-AR" w:eastAsia="es-AR"/>
+              </w:rPr>
+              <w:t>)</w:t>
+            </w:r>
+          </w:p>
+        </w:tc>
+        <w:tc>
+          <w:tcPr>
+            <w:tcW w:w="0" w:type="auto"/>
+            <w:tcBorders>
+              <w:top w:val="single" w:sz="4" w:space="0" w:color="000000"/>
+              <w:left w:val="single" w:sz="4" w:space="0" w:color="000000"/>
+              <w:bottom w:val="single" w:sz="4" w:space="0" w:color="000000"/>
+              <w:right w:val="single" w:sz="4" w:space="0" w:color="000000"/>
+            </w:tcBorders>
+            <w:tcMar>
+              <w:top w:w="0" w:type="dxa"/>
+              <w:left w:w="70" w:type="dxa"/>
+              <w:bottom w:w="0" w:type="dxa"/>
+              <w:right w:w="70" w:type="dxa"/>
+            </w:tcMar>
+            <w:hideMark/>
+          </w:tcPr>
+          <w:p>
+            <w:pPr>
+              <w:spacing w:after="0" w:line="240" w:lineRule="auto"/>
+              <w:jc w:val="center"/>
+              <w:rPr>
+                <w:rFonts w:ascii="Arial" w:eastAsia="Times New Roman" w:hAnsi="Arial" w:cs="Arial"/>
+                <w:sz w:val="24"/>
+                <w:szCs w:val="24"/>
+                <w:lang w:val="es-AR" w:eastAsia="es-AR"/>
+              </w:rPr>
+            </w:pPr>
+            <w:r>
+              <w:rPr>
+                <w:rFonts w:ascii="Arial" w:eastAsia="Times New Roman" w:hAnsi="Arial" w:cs="Arial"/>
+                <w:sz w:val="24"/>
+                <w:szCs w:val="24"/>
+                <w:lang w:val="es-AR" w:eastAsia="es-AR"/>
+              </w:rPr>
+              <w:t>Log</w:t>
+            </w:r>
+            <w:r>
+              <w:rPr>
+                <w:rFonts w:ascii="Arial" w:eastAsia="Times New Roman" w:hAnsi="Arial" w:cs="Arial"/>
+                <w:sz w:val="24"/>
+                <w:szCs w:val="24"/>
+                <w:vertAlign w:val="subscript"/>
+                <w:lang w:val="es-AR" w:eastAsia="es-AR"/>
+              </w:rPr>
+              <w:t>2</w:t>
+            </w:r>
+            <w:r>
+              <w:rPr>
+                <w:rFonts w:ascii="Arial" w:eastAsia="Times New Roman" w:hAnsi="Arial" w:cs="Arial"/>
+                <w:sz w:val="24"/>
+                <w:szCs w:val="24"/>
+                <w:lang w:val="es-AR" w:eastAsia="es-AR"/>
+              </w:rPr>
+              <w:t>(1000N</w:t>
+            </w:r>
+            <w:r>
+              <w:rPr>
+                <w:rFonts w:ascii="Arial" w:eastAsia="Times New Roman" w:hAnsi="Arial" w:cs="Arial"/>
+                <w:sz w:val="24"/>
+                <w:szCs w:val="24"/>
+                <w:vertAlign w:val="subscript"/>
+                <w:lang w:val="es-AR" w:eastAsia="es-AR"/>
+              </w:rPr>
+              <w:t>5</w:t>
+            </w:r>
+            <w:r>
+              <w:rPr>
+                <w:rFonts w:ascii="Arial" w:eastAsia="Times New Roman" w:hAnsi="Arial" w:cs="Arial"/>
+                <w:sz w:val="24"/>
+                <w:szCs w:val="24"/>
+                <w:lang w:val="es-AR" w:eastAsia="es-AR"/>
+              </w:rPr>
+              <w:t>)</w:t>
+            </w:r>
+          </w:p>
+        </w:tc>
+      </w:tr>
+      <w:tr>
+        <w:tc>
+          <w:tcPr>
+            <w:tcW w:w="0" w:type="auto"/>
+            <w:tcBorders>
+              <w:top w:val="single" w:sz="4" w:space="0" w:color="000000"/>
+              <w:left w:val="single" w:sz="4" w:space="0" w:color="000000"/>
+              <w:bottom w:val="single" w:sz="4" w:space="0" w:color="000000"/>
+              <w:right w:val="single" w:sz="4" w:space="0" w:color="000000"/>
+            </w:tcBorders>
+            <w:tcMar>
+              <w:top w:w="0" w:type="dxa"/>
+              <w:left w:w="70" w:type="dxa"/>
+              <w:bottom w:w="0" w:type="dxa"/>
+              <w:right w:w="70" w:type="dxa"/>
+            </w:tcMar>
+            <w:hideMark/>
+          </w:tcPr>
+          <w:p>
+            <w:pPr>
+              <w:spacing w:after="0" w:line="240" w:lineRule="auto"/>
+              <w:rPr>
+                <w:rFonts w:ascii="Arial" w:eastAsia="Times New Roman" w:hAnsi="Arial" w:cs="Arial"/>
+                <w:sz w:val="24"/>
+                <w:szCs w:val="24"/>
+                <w:lang w:val="es-AR" w:eastAsia="es-AR"/>
+              </w:rPr>
+            </w:pPr>
+            <w:r>
+              <w:rPr>
+                <w:rFonts w:ascii="Arial" w:eastAsia="Times New Roman" w:hAnsi="Arial" w:cs="Arial"/>
+                <w:color w:val="000000"/>
+                <w:sz w:val="24"/>
+                <w:szCs w:val="24"/>
+                <w:lang w:val="es-AR" w:eastAsia="es-AR"/>
+              </w:rPr>
+              <w:t>3</w:t>
+            </w:r>
+            <w:r>
+              <w:rPr>
+                <w:rFonts w:ascii="Arial" w:eastAsia="Times New Roman" w:hAnsi="Arial" w:cs="Arial"/>
+                <w:color w:val="000000"/>
+                <w:sz w:val="24"/>
+                <w:szCs w:val="24"/>
+                <w:vertAlign w:val="superscript"/>
+                <w:lang w:val="es-AR" w:eastAsia="es-AR"/>
+              </w:rPr>
+              <w:t>n</w:t>
+            </w:r>
+          </w:p>
+        </w:tc>
+        <w:tc>
+          <w:tcPr>
+            <w:tcW w:w="0" w:type="auto"/>
+            <w:tcBorders>
+              <w:top w:val="single" w:sz="4" w:space="0" w:color="000000"/>
+              <w:left w:val="single" w:sz="4" w:space="0" w:color="000000"/>
+              <w:bottom w:val="single" w:sz="4" w:space="0" w:color="000000"/>
+              <w:right w:val="single" w:sz="4" w:space="0" w:color="000000"/>
+            </w:tcBorders>
+            <w:tcMar>
+              <w:top w:w="0" w:type="dxa"/>
+              <w:left w:w="70" w:type="dxa"/>
+              <w:bottom w:w="0" w:type="dxa"/>
+              <w:right w:w="70" w:type="dxa"/>
+            </w:tcMar>
+            <w:hideMark/>
+          </w:tcPr>
+          <w:p>
+            <w:pPr>
+              <w:spacing w:after="0" w:line="240" w:lineRule="auto"/>
+              <w:rPr>
+                <w:rFonts w:ascii="Arial" w:eastAsia="Times New Roman" w:hAnsi="Arial" w:cs="Arial"/>
+                <w:sz w:val="24"/>
+                <w:szCs w:val="24"/>
+                <w:lang w:val="es-AR" w:eastAsia="es-AR"/>
+              </w:rPr>
+            </w:pPr>
+            <w:r>
+              <w:rPr>
+                <w:rFonts w:ascii="Arial" w:eastAsia="Times New Roman" w:hAnsi="Arial" w:cs="Arial"/>
+                <w:color w:val="000000"/>
+                <w:sz w:val="24"/>
+                <w:szCs w:val="24"/>
+                <w:lang w:val="es-AR" w:eastAsia="es-AR"/>
+              </w:rPr>
+              <w:t>N</w:t>
+            </w:r>
+            <w:r>
+              <w:rPr>
+                <w:rFonts w:ascii="Arial" w:eastAsia="Times New Roman" w:hAnsi="Arial" w:cs="Arial"/>
+                <w:color w:val="000000"/>
+                <w:sz w:val="24"/>
+                <w:szCs w:val="24"/>
+                <w:vertAlign w:val="subscript"/>
+                <w:lang w:val="es-AR" w:eastAsia="es-AR"/>
+              </w:rPr>
+              <w:t>6</w:t>
+            </w:r>
+          </w:p>
+        </w:tc>
+        <w:tc>
+          <w:tcPr>
+            <w:tcW w:w="0" w:type="auto"/>
+            <w:tcBorders>
+              <w:top w:val="single" w:sz="4" w:space="0" w:color="000000"/>
+              <w:left w:val="single" w:sz="4" w:space="0" w:color="000000"/>
+              <w:bottom w:val="single" w:sz="4" w:space="0" w:color="000000"/>
+              <w:right w:val="single" w:sz="4" w:space="0" w:color="000000"/>
+            </w:tcBorders>
+            <w:tcMar>
+              <w:top w:w="0" w:type="dxa"/>
+              <w:left w:w="70" w:type="dxa"/>
+              <w:bottom w:w="0" w:type="dxa"/>
+              <w:right w:w="70" w:type="dxa"/>
+            </w:tcMar>
+            <w:hideMark/>
+          </w:tcPr>
+          <w:p>
+            <w:pPr>
+              <w:spacing w:after="0" w:line="240" w:lineRule="auto"/>
+              <w:jc w:val="center"/>
+              <w:rPr>
+                <w:rFonts w:ascii="Arial" w:eastAsia="Times New Roman" w:hAnsi="Arial" w:cs="Arial"/>
+                <w:sz w:val="24"/>
+                <w:szCs w:val="24"/>
+                <w:lang w:val="es-AR" w:eastAsia="es-AR"/>
+              </w:rPr>
+            </w:pPr>
+            <w:r>
+              <w:rPr>
+                <w:rFonts w:ascii="Arial" w:eastAsia="Times New Roman" w:hAnsi="Arial" w:cs="Arial"/>
+                <w:sz w:val="24"/>
+                <w:szCs w:val="24"/>
+                <w:lang w:val="es-AR" w:eastAsia="es-AR"/>
+              </w:rPr>
+              <w:t>Log</w:t>
+            </w:r>
+            <w:r>
+              <w:rPr>
+                <w:rFonts w:ascii="Arial" w:eastAsia="Times New Roman" w:hAnsi="Arial" w:cs="Arial"/>
+                <w:sz w:val="24"/>
+                <w:szCs w:val="24"/>
+                <w:vertAlign w:val="subscript"/>
+                <w:lang w:val="es-AR" w:eastAsia="es-AR"/>
+              </w:rPr>
+              <w:t>3</w:t>
+            </w:r>
+            <w:r>
+              <w:rPr>
+                <w:rFonts w:ascii="Arial" w:eastAsia="Times New Roman" w:hAnsi="Arial" w:cs="Arial"/>
+                <w:sz w:val="24"/>
+                <w:szCs w:val="24"/>
+                <w:lang w:val="es-AR" w:eastAsia="es-AR"/>
+              </w:rPr>
+              <w:t>(100N</w:t>
+            </w:r>
+            <w:r>
+              <w:rPr>
+                <w:rFonts w:ascii="Arial" w:eastAsia="Times New Roman" w:hAnsi="Arial" w:cs="Arial"/>
+                <w:sz w:val="24"/>
+                <w:szCs w:val="24"/>
+                <w:vertAlign w:val="subscript"/>
+                <w:lang w:val="es-AR" w:eastAsia="es-AR"/>
+              </w:rPr>
+              <w:t>6</w:t>
+            </w:r>
+            <w:r>
+              <w:rPr>
+                <w:rFonts w:ascii="Arial" w:eastAsia="Times New Roman" w:hAnsi="Arial" w:cs="Arial"/>
+                <w:sz w:val="24"/>
+                <w:szCs w:val="24"/>
+                <w:lang w:val="es-AR" w:eastAsia="es-AR"/>
+              </w:rPr>
+              <w:t>)</w:t>
+            </w:r>
+          </w:p>
+        </w:tc>
+        <w:tc>
+          <w:tcPr>
+            <w:tcW w:w="0" w:type="auto"/>
+            <w:tcBorders>
+              <w:top w:val="single" w:sz="4" w:space="0" w:color="000000"/>
+              <w:left w:val="single" w:sz="4" w:space="0" w:color="000000"/>
+              <w:bottom w:val="single" w:sz="4" w:space="0" w:color="000000"/>
+              <w:right w:val="single" w:sz="4" w:space="0" w:color="000000"/>
+            </w:tcBorders>
+            <w:tcMar>
+              <w:top w:w="0" w:type="dxa"/>
+              <w:left w:w="70" w:type="dxa"/>
+              <w:bottom w:w="0" w:type="dxa"/>
+              <w:right w:w="70" w:type="dxa"/>
+            </w:tcMar>
+            <w:hideMark/>
+          </w:tcPr>
+          <w:p>
+            <w:pPr>
+              <w:spacing w:after="0" w:line="240" w:lineRule="auto"/>
+              <w:jc w:val="center"/>
+              <w:rPr>
+                <w:rFonts w:ascii="Arial" w:eastAsia="Times New Roman" w:hAnsi="Arial" w:cs="Arial"/>
+                <w:sz w:val="24"/>
+                <w:szCs w:val="24"/>
+                <w:lang w:val="es-AR" w:eastAsia="es-AR"/>
+              </w:rPr>
+            </w:pPr>
+            <w:r>
+              <w:rPr>
+                <w:rFonts w:ascii="Arial" w:eastAsia="Times New Roman" w:hAnsi="Arial" w:cs="Arial"/>
+                <w:sz w:val="24"/>
+                <w:szCs w:val="24"/>
+                <w:lang w:val="es-AR" w:eastAsia="es-AR"/>
+              </w:rPr>
+              <w:t>Log</w:t>
+            </w:r>
+            <w:r>
+              <w:rPr>
+                <w:rFonts w:ascii="Arial" w:eastAsia="Times New Roman" w:hAnsi="Arial" w:cs="Arial"/>
+                <w:sz w:val="24"/>
+                <w:szCs w:val="24"/>
+                <w:vertAlign w:val="subscript"/>
+                <w:lang w:val="es-AR" w:eastAsia="es-AR"/>
+              </w:rPr>
+              <w:t>3</w:t>
+            </w:r>
+            <w:r>
+              <w:rPr>
+                <w:rFonts w:ascii="Arial" w:eastAsia="Times New Roman" w:hAnsi="Arial" w:cs="Arial"/>
+                <w:sz w:val="24"/>
+                <w:szCs w:val="24"/>
+                <w:lang w:val="es-AR" w:eastAsia="es-AR"/>
+              </w:rPr>
+              <w:t>(</w:t>
+            </w:r>
+            <w:bookmarkStart w:id="0" w:name="_GoBack"/>
+            <w:bookmarkEnd w:id="0"/>
+            <w:r>
+              <w:rPr>
+                <w:rFonts w:ascii="Arial" w:eastAsia="Times New Roman" w:hAnsi="Arial" w:cs="Arial"/>
+                <w:sz w:val="24"/>
+                <w:szCs w:val="24"/>
+                <w:lang w:val="es-AR" w:eastAsia="es-AR"/>
+              </w:rPr>
+              <w:t>1000N</w:t>
+            </w:r>
+            <w:r>
+              <w:rPr>
+                <w:rFonts w:ascii="Arial" w:eastAsia="Times New Roman" w:hAnsi="Arial" w:cs="Arial"/>
+                <w:sz w:val="24"/>
+                <w:szCs w:val="24"/>
+                <w:vertAlign w:val="subscript"/>
+                <w:lang w:val="es-AR" w:eastAsia="es-AR"/>
+              </w:rPr>
+              <w:t>5</w:t>
+            </w:r>
+            <w:r>
+              <w:rPr>
+                <w:rFonts w:ascii="Arial" w:eastAsia="Times New Roman" w:hAnsi="Arial" w:cs="Arial"/>
+                <w:sz w:val="24"/>
+                <w:szCs w:val="24"/>
+                <w:lang w:val="es-AR" w:eastAsia="es-AR"/>
+              </w:rPr>
+              <w:t>)</w:t>
+            </w:r>
+          </w:p>
+        </w:tc>
+      </w:tr>
+    </w:tbl>
+    <w:p>
+      <w:pPr>
+        <w:spacing w:before="100" w:beforeAutospacing="1" w:after="100" w:afterAutospacing="1" w:line="240" w:lineRule="auto"/>
+        <w:textAlignment w:val="baseline"/>
+        <w:rPr>
+          <w:rFonts w:ascii="Arial" w:eastAsia="Times New Roman" w:hAnsi="Arial" w:cs="Arial"/>
+          <w:color w:val="000000"/>
+          <w:sz w:val="24"/>
+          <w:szCs w:val="24"/>
+          <w:lang w:val="es-AR" w:eastAsia="es-AR"/>
+        </w:rPr>
+      </w:pPr>
+      <w:r>
+        <w:rPr>
+          <w:rFonts w:ascii="Arial" w:eastAsia="Times New Roman" w:hAnsi="Arial" w:cs="Arial"/>
+          <w:color w:val="000000"/>
+          <w:sz w:val="24"/>
+          <w:szCs w:val="24"/>
+          <w:lang w:val="es-AR" w:eastAsia="es-AR"/>
+        </w:rPr>
+        <w:t xml:space="preserve">6) </w:t>
+      </w:r>
+    </w:p>
+    <w:p>
+      <w:pPr>
+        <w:rPr>
+          <w:rFonts w:ascii="Arial" w:hAnsi="Arial" w:cs="Arial"/>
+          <w:sz w:val="24"/>
+          <w:szCs w:val="24"/>
+          <w:lang w:val="es-ES"/>
+        </w:rPr>
+      </w:pPr>
     </w:p>
     <w:sectPr>
       <w:pgSz w:w="12240" w:h="15840"/>
@@ -2328,6 +3947,127 @@
     </w:sectPr>
   </w:body>
 </w:document>
+</file>
+
+<file path=word/numbering.xml><?xml version="1.0" encoding="utf-8"?>
+<w:numbering xmlns:wpc="http://schemas.microsoft.com/office/word/2010/wordprocessingCanvas" xmlns:cx="http://schemas.microsoft.com/office/drawing/2014/chartex" xmlns:cx1="http://schemas.microsoft.com/office/drawing/2015/9/8/chartex" xmlns:mc="http://schemas.openxmlformats.org/markup-compatibility/2006" xmlns:o="urn:schemas-microsoft-com:office:office" xmlns:r="http://schemas.openxmlformats.org/officeDocument/2006/relationships" xmlns:m="http://schemas.openxmlformats.org/officeDocument/2006/math" xmlns:v="urn:schemas-microsoft-com:vml" xmlns:wp14="http://schemas.microsoft.com/office/word/2010/wordprocessingDrawing" xmlns:wp="http://schemas.openxmlformats.org/drawingml/2006/wordprocessingDrawing" xmlns:w10="urn:schemas-microsoft-com:office:word" xmlns:w="http://schemas.openxmlformats.org/wordprocessingml/2006/main" xmlns:w14="http://schemas.microsoft.com/office/word/2010/wordml" xmlns:w15="http://schemas.microsoft.com/office/word/2012/wordml" xmlns:w16se="http://schemas.microsoft.com/office/word/2015/wordml/symex" xmlns:wpg="http://schemas.microsoft.com/office/word/2010/wordprocessingGroup" xmlns:wpi="http://schemas.microsoft.com/office/word/2010/wordprocessingInk" xmlns:wne="http://schemas.microsoft.com/office/word/2006/wordml" xmlns:wps="http://schemas.microsoft.com/office/word/2010/wordprocessingShape" mc:Ignorable="w14 w15 w16se wp14">
+  <w:abstractNum w:abstractNumId="0" w15:restartNumberingAfterBreak="0">
+    <w:nsid w:val="02390450"/>
+    <w:multiLevelType w:val="multilevel"/>
+    <w:tmpl w:val="54EAFBB2"/>
+    <w:lvl w:ilvl="0">
+      <w:start w:val="1"/>
+      <w:numFmt w:val="decimal"/>
+      <w:lvlText w:val="%1."/>
+      <w:lvlJc w:val="left"/>
+      <w:pPr>
+        <w:tabs>
+          <w:tab w:val="num" w:pos="720"/>
+        </w:tabs>
+        <w:ind w:left="720" w:hanging="360"/>
+      </w:pPr>
+    </w:lvl>
+    <w:lvl w:ilvl="1" w:tentative="1">
+      <w:start w:val="1"/>
+      <w:numFmt w:val="decimal"/>
+      <w:lvlText w:val="%2."/>
+      <w:lvlJc w:val="left"/>
+      <w:pPr>
+        <w:tabs>
+          <w:tab w:val="num" w:pos="1440"/>
+        </w:tabs>
+        <w:ind w:left="1440" w:hanging="360"/>
+      </w:pPr>
+    </w:lvl>
+    <w:lvl w:ilvl="2" w:tentative="1">
+      <w:start w:val="1"/>
+      <w:numFmt w:val="decimal"/>
+      <w:lvlText w:val="%3."/>
+      <w:lvlJc w:val="left"/>
+      <w:pPr>
+        <w:tabs>
+          <w:tab w:val="num" w:pos="2160"/>
+        </w:tabs>
+        <w:ind w:left="2160" w:hanging="360"/>
+      </w:pPr>
+    </w:lvl>
+    <w:lvl w:ilvl="3" w:tentative="1">
+      <w:start w:val="1"/>
+      <w:numFmt w:val="decimal"/>
+      <w:lvlText w:val="%4."/>
+      <w:lvlJc w:val="left"/>
+      <w:pPr>
+        <w:tabs>
+          <w:tab w:val="num" w:pos="2880"/>
+        </w:tabs>
+        <w:ind w:left="2880" w:hanging="360"/>
+      </w:pPr>
+    </w:lvl>
+    <w:lvl w:ilvl="4" w:tentative="1">
+      <w:start w:val="1"/>
+      <w:numFmt w:val="decimal"/>
+      <w:lvlText w:val="%5."/>
+      <w:lvlJc w:val="left"/>
+      <w:pPr>
+        <w:tabs>
+          <w:tab w:val="num" w:pos="3600"/>
+        </w:tabs>
+        <w:ind w:left="3600" w:hanging="360"/>
+      </w:pPr>
+    </w:lvl>
+    <w:lvl w:ilvl="5" w:tentative="1">
+      <w:start w:val="1"/>
+      <w:numFmt w:val="decimal"/>
+      <w:lvlText w:val="%6."/>
+      <w:lvlJc w:val="left"/>
+      <w:pPr>
+        <w:tabs>
+          <w:tab w:val="num" w:pos="4320"/>
+        </w:tabs>
+        <w:ind w:left="4320" w:hanging="360"/>
+      </w:pPr>
+    </w:lvl>
+    <w:lvl w:ilvl="6" w:tentative="1">
+      <w:start w:val="1"/>
+      <w:numFmt w:val="decimal"/>
+      <w:lvlText w:val="%7."/>
+      <w:lvlJc w:val="left"/>
+      <w:pPr>
+        <w:tabs>
+          <w:tab w:val="num" w:pos="5040"/>
+        </w:tabs>
+        <w:ind w:left="5040" w:hanging="360"/>
+      </w:pPr>
+    </w:lvl>
+    <w:lvl w:ilvl="7" w:tentative="1">
+      <w:start w:val="1"/>
+      <w:numFmt w:val="decimal"/>
+      <w:lvlText w:val="%8."/>
+      <w:lvlJc w:val="left"/>
+      <w:pPr>
+        <w:tabs>
+          <w:tab w:val="num" w:pos="5760"/>
+        </w:tabs>
+        <w:ind w:left="5760" w:hanging="360"/>
+      </w:pPr>
+    </w:lvl>
+    <w:lvl w:ilvl="8" w:tentative="1">
+      <w:start w:val="1"/>
+      <w:numFmt w:val="decimal"/>
+      <w:lvlText w:val="%9."/>
+      <w:lvlJc w:val="left"/>
+      <w:pPr>
+        <w:tabs>
+          <w:tab w:val="num" w:pos="6480"/>
+        </w:tabs>
+        <w:ind w:left="6480" w:hanging="360"/>
+      </w:pPr>
+    </w:lvl>
+  </w:abstractNum>
+  <w:num w:numId="1">
+    <w:abstractNumId w:val="0"/>
+  </w:num>
+</w:numbering>
 </file>
 
 <file path=word/styles.xml><?xml version="1.0" encoding="utf-8"?>
@@ -2778,6 +4518,23 @@
       <w:u w:val="single"/>
     </w:rPr>
   </w:style>
+  <w:style w:type="paragraph" w:styleId="NormalWeb">
+    <w:name w:val="Normal (Web)"/>
+    <w:basedOn w:val="Normal"/>
+    <w:uiPriority w:val="99"/>
+    <w:semiHidden/>
+    <w:unhideWhenUsed/>
+    <w:rsid w:val="00E324E7"/>
+    <w:pPr>
+      <w:spacing w:before="100" w:beforeAutospacing="1" w:after="100" w:afterAutospacing="1" w:line="240" w:lineRule="auto"/>
+    </w:pPr>
+    <w:rPr>
+      <w:rFonts w:ascii="Times New Roman" w:eastAsia="Times New Roman" w:hAnsi="Times New Roman" w:cs="Times New Roman"/>
+      <w:sz w:val="24"/>
+      <w:szCs w:val="24"/>
+      <w:lang w:val="es-AR" w:eastAsia="es-AR"/>
+    </w:rPr>
+  </w:style>
 </w:styles>
 </file>
 

</xml_diff>

<commit_message>
Correciones guia de complejidad
</commit_message>
<xml_diff>
--- a/Códigos teoría/Guía de TPs/Práctica VI (Complejidad Computacional)/Resolución.docx
+++ b/Códigos teoría/Guía de TPs/Práctica VI (Complejidad Computacional)/Resolución.docx
@@ -862,17 +862,38 @@
           <w:szCs w:val="24"/>
           <w:lang w:val="es-ES"/>
         </w:rPr>
-        <w:t>como (2+1)</w:t>
-      </w:r>
+        <w:t>como (2+</w:t>
+      </w:r>
+      <w:proofErr w:type="gramStart"/>
       <w:r>
         <w:rPr>
           <w:rFonts w:ascii="Arial" w:eastAsia="MS PGothic" w:hAnsi="Arial" w:cs="Arial"/>
           <w:sz w:val="24"/>
           <w:szCs w:val="24"/>
+          <w:lang w:val="es-ES"/>
+        </w:rPr>
+        <w:t>1)</w:t>
+      </w:r>
+      <w:r>
+        <w:rPr>
+          <w:rFonts w:ascii="Arial" w:eastAsia="MS PGothic" w:hAnsi="Arial" w:cs="Arial"/>
+          <w:sz w:val="24"/>
+          <w:szCs w:val="24"/>
           <w:vertAlign w:val="superscript"/>
           <w:lang w:val="es-ES"/>
         </w:rPr>
-        <w:t xml:space="preserve">n </w:t>
+        <w:t>n</w:t>
+      </w:r>
+      <w:proofErr w:type="gramEnd"/>
+      <w:r>
+        <w:rPr>
+          <w:rFonts w:ascii="Arial" w:eastAsia="MS PGothic" w:hAnsi="Arial" w:cs="Arial"/>
+          <w:sz w:val="24"/>
+          <w:szCs w:val="24"/>
+          <w:vertAlign w:val="superscript"/>
+          <w:lang w:val="es-ES"/>
+        </w:rPr>
+        <w:t xml:space="preserve"> </w:t>
       </w:r>
       <w:r>
         <w:rPr>
@@ -978,7 +999,21 @@
         <w:rPr>
           <w:lang w:val="es-ES"/>
         </w:rPr>
-        <w:t>Suponiendo que se sabe que el tiempo de ejecución de un algoritmo pertenece a O(NlogN) y que el de otro algoritmo pertenece a O(n2), se pide:</w:t>
+        <w:t>Suponiendo que se sabe que el tiempo de ejecución de un algoritmo pertenece a O(</w:t>
+      </w:r>
+      <w:proofErr w:type="spellStart"/>
+      <w:r>
+        <w:rPr>
+          <w:lang w:val="es-ES"/>
+        </w:rPr>
+        <w:t>NlogN</w:t>
+      </w:r>
+      <w:proofErr w:type="spellEnd"/>
+      <w:r>
+        <w:rPr>
+          <w:lang w:val="es-ES"/>
+        </w:rPr>
+        <w:t>) y que el de otro algoritmo pertenece a O(n2), se pide:</w:t>
       </w:r>
       <w:r>
         <w:rPr>
@@ -1025,7 +1060,21 @@
           <w:lang w:val="es-ES"/>
         </w:rPr>
         <w:br/>
-        <w:t>El primero crece más lento que el segundo, por lo que en casos en los que N sea muy grande, O(nlog(n)) será mejor.</w:t>
+        <w:t>El primero crece más lento que el segundo, por lo que en casos en los que N sea muy grande, O(</w:t>
+      </w:r>
+      <w:proofErr w:type="spellStart"/>
+      <w:r>
+        <w:rPr>
+          <w:lang w:val="es-ES"/>
+        </w:rPr>
+        <w:t>nlog</w:t>
+      </w:r>
+      <w:proofErr w:type="spellEnd"/>
+      <w:r>
+        <w:rPr>
+          <w:lang w:val="es-ES"/>
+        </w:rPr>
+        <w:t>(n)) será mejor.</w:t>
       </w:r>
       <w:r>
         <w:rPr>
@@ -1052,59 +1101,51 @@
         </w:rPr>
         <w:br/>
       </w:r>
-      <w:hyperlink r:id="rId5" w:history="1">
-        <w:r>
-          <w:rPr>
-            <w:rStyle w:val="Hipervnculo"/>
-            <w:lang w:val="es-ES"/>
-          </w:rPr>
-          <w:t>https://stackoverflow.com/questions/23329234/which-is-better-on-log-n-or-on2</w:t>
-        </w:r>
-      </w:hyperlink>
-      <w:r>
-        <w:rPr>
-          <w:lang w:val="es-ES"/>
-        </w:rPr>
-        <w:t xml:space="preserve"> </w:t>
-      </w:r>
-      <w:r>
-        <w:rPr>
-          <w:lang w:val="es-ES"/>
-        </w:rPr>
-        <w:br/>
-      </w:r>
-      <w:r>
-        <w:rPr>
-          <w:lang w:val="es-ES"/>
-        </w:rPr>
-        <w:br/>
-        <w:t>Aparentemente, O(n</w:t>
-      </w:r>
-      <w:r>
-        <w:rPr>
-          <w:vertAlign w:val="superscript"/>
-          <w:lang w:val="es-ES"/>
-        </w:rPr>
-        <w:t>2</w:t>
-      </w:r>
-      <w:r>
-        <w:rPr>
-          <w:lang w:val="es-ES"/>
-        </w:rPr>
-        <w:t>) es mejor que O(nlog(n)) cuando n &lt; 100 en la vida real. Así que implementaría O(n</w:t>
-      </w:r>
-      <w:r>
-        <w:rPr>
-          <w:vertAlign w:val="superscript"/>
-          <w:lang w:val="es-ES"/>
-        </w:rPr>
-        <w:t>2</w:t>
-      </w:r>
-      <w:r>
-        <w:rPr>
-          <w:lang w:val="es-ES"/>
-        </w:rPr>
-        <w:t>) cuando n &lt; 100.</w:t>
+      <w:r>
+        <w:rPr>
+          <w:lang w:val="es-ES"/>
+        </w:rPr>
+        <w:t>Depende de las constantes que acompañan a la expres</w:t>
+      </w:r>
+      <w:r>
+        <w:rPr>
+          <w:lang w:val="es-ES"/>
+        </w:rPr>
+        <w:t>ión original. La notación Big-O nos esconde dichas constantes, y es posible que, para ciertos valores, el algoritmo de complejidad O(n2) sea mejor que el algoritmo de O(</w:t>
+      </w:r>
+      <w:proofErr w:type="spellStart"/>
+      <w:r>
+        <w:rPr>
+          <w:lang w:val="es-ES"/>
+        </w:rPr>
+        <w:t>NlogN</w:t>
+      </w:r>
+      <w:proofErr w:type="spellEnd"/>
+      <w:r>
+        <w:rPr>
+          <w:lang w:val="es-ES"/>
+        </w:rPr>
+        <w:t xml:space="preserve">). </w:t>
+      </w:r>
+      <w:r>
+        <w:rPr>
+          <w:lang w:val="es-ES"/>
+        </w:rPr>
+        <w:t>No podemos saber en qué casos utilizar cada uno. A lo sumo, podríamos decir, que si N es muy grande, lo correcto sería utilizar el algoritmo con complejidad O(</w:t>
+      </w:r>
+      <w:proofErr w:type="spellStart"/>
+      <w:r>
+        <w:rPr>
+          <w:lang w:val="es-ES"/>
+        </w:rPr>
+        <w:t>NlogN</w:t>
+      </w:r>
+      <w:proofErr w:type="spellEnd"/>
+      <w:r>
+        <w:rPr>
+          <w:lang w:val="es-ES"/>
+        </w:rPr>
+        <w:t>).</w:t>
       </w:r>
       <w:r>
         <w:rPr>
@@ -1150,7 +1191,27 @@
           <w:szCs w:val="24"/>
           <w:lang w:val="es-ES"/>
         </w:rPr>
-        <w:t>En donde la cantidad de elementos a ordenar sea menor a 100, y en donde los ciclos aninados ejecuten instrucciones de corto tiempo de ejecución.</w:t>
+        <w:t xml:space="preserve">Cuando la cantidad de elementos a ordenar sea pequeña podríamos utilizar el algoritmo cuadrático. Una de las mejoras de </w:t>
+      </w:r>
+      <w:proofErr w:type="spellStart"/>
+      <w:r>
+        <w:rPr>
+          <w:rFonts w:ascii="Arial" w:hAnsi="Arial" w:cs="Arial"/>
+          <w:sz w:val="24"/>
+          <w:szCs w:val="24"/>
+          <w:lang w:val="es-ES"/>
+        </w:rPr>
+        <w:t>QuickSort</w:t>
+      </w:r>
+      <w:proofErr w:type="spellEnd"/>
+      <w:r>
+        <w:rPr>
+          <w:rFonts w:ascii="Arial" w:hAnsi="Arial" w:cs="Arial"/>
+          <w:sz w:val="24"/>
+          <w:szCs w:val="24"/>
+          <w:lang w:val="es-ES"/>
+        </w:rPr>
+        <w:t xml:space="preserve"> es utilizar el algoritmo de inserción cuando la cantidad de elementos es pequeña, ya que resulta más rápido de esta forma ordenar el conjunto.</w:t>
       </w:r>
     </w:p>
     <w:p>
@@ -1185,7 +1246,43 @@
           <w:sz w:val="24"/>
           <w:szCs w:val="24"/>
         </w:rPr>
-        <w:t xml:space="preserve">5) Sea la siguiente tabla: </w:t>
+        <w:t xml:space="preserve">5) Sea la </w:t>
+      </w:r>
+      <w:proofErr w:type="spellStart"/>
+      <w:r>
+        <w:rPr>
+          <w:rFonts w:ascii="Arial" w:hAnsi="Arial" w:cs="Arial"/>
+          <w:sz w:val="24"/>
+          <w:szCs w:val="24"/>
+        </w:rPr>
+        <w:t>siguiente</w:t>
+      </w:r>
+      <w:proofErr w:type="spellEnd"/>
+      <w:r>
+        <w:rPr>
+          <w:rFonts w:ascii="Arial" w:hAnsi="Arial" w:cs="Arial"/>
+          <w:sz w:val="24"/>
+          <w:szCs w:val="24"/>
+        </w:rPr>
+        <w:t xml:space="preserve"> </w:t>
+      </w:r>
+      <w:proofErr w:type="spellStart"/>
+      <w:r>
+        <w:rPr>
+          <w:rFonts w:ascii="Arial" w:hAnsi="Arial" w:cs="Arial"/>
+          <w:sz w:val="24"/>
+          <w:szCs w:val="24"/>
+        </w:rPr>
+        <w:t>tabla</w:t>
+      </w:r>
+      <w:proofErr w:type="spellEnd"/>
+      <w:r>
+        <w:rPr>
+          <w:rFonts w:ascii="Arial" w:hAnsi="Arial" w:cs="Arial"/>
+          <w:sz w:val="24"/>
+          <w:szCs w:val="24"/>
+        </w:rPr>
+        <w:t xml:space="preserve">: </w:t>
       </w:r>
       <w:r>
         <w:rPr>
@@ -1442,6 +1539,7 @@
                 <w:szCs w:val="24"/>
               </w:rPr>
             </w:pPr>
+            <w:proofErr w:type="spellStart"/>
             <w:r>
               <w:rPr>
                 <w:rFonts w:ascii="Arial" w:hAnsi="Arial" w:cs="Arial"/>
@@ -1449,7 +1547,17 @@
                 <w:sz w:val="24"/>
                 <w:szCs w:val="24"/>
               </w:rPr>
-              <w:t xml:space="preserve">Incremento </w:t>
+              <w:t>Incremento</w:t>
+            </w:r>
+            <w:proofErr w:type="spellEnd"/>
+            <w:r>
+              <w:rPr>
+                <w:rFonts w:ascii="Arial" w:hAnsi="Arial" w:cs="Arial"/>
+                <w:color w:val="000000"/>
+                <w:sz w:val="24"/>
+                <w:szCs w:val="24"/>
+              </w:rPr>
+              <w:t xml:space="preserve"> </w:t>
             </w:r>
           </w:p>
         </w:tc>
@@ -2095,33 +2203,52 @@
           <w:lang w:val="es-ES"/>
         </w:rPr>
       </w:pPr>
-      <w:r>
-        <w:rPr>
-          <w:color w:val="auto"/>
-          <w:lang w:val="es-ES"/>
-        </w:rPr>
-        <w:t xml:space="preserve">Se pide: </w:t>
-      </w:r>
     </w:p>
     <w:p>
       <w:pPr>
         <w:pStyle w:val="Default"/>
-        <w:ind w:firstLine="720"/>
         <w:rPr>
           <w:color w:val="auto"/>
           <w:lang w:val="es-ES"/>
         </w:rPr>
       </w:pPr>
-      <w:r>
-        <w:rPr>
-          <w:color w:val="auto"/>
-          <w:lang w:val="es-ES"/>
-        </w:rPr>
-        <w:t xml:space="preserve">a) completar los datos que faltan. </w:t>
-      </w:r>
     </w:p>
     <w:p>
       <w:pPr>
+        <w:pStyle w:val="Default"/>
+        <w:rPr>
+          <w:color w:val="auto"/>
+          <w:lang w:val="es-ES"/>
+        </w:rPr>
+      </w:pPr>
+      <w:r>
+        <w:rPr>
+          <w:color w:val="auto"/>
+          <w:lang w:val="es-ES"/>
+        </w:rPr>
+        <w:lastRenderedPageBreak/>
+        <w:t xml:space="preserve">Se pide: </w:t>
+      </w:r>
+    </w:p>
+    <w:p>
+      <w:pPr>
+        <w:pStyle w:val="Default"/>
+        <w:ind w:firstLine="720"/>
+        <w:rPr>
+          <w:color w:val="auto"/>
+          <w:lang w:val="es-ES"/>
+        </w:rPr>
+      </w:pPr>
+      <w:r>
+        <w:rPr>
+          <w:color w:val="auto"/>
+          <w:lang w:val="es-ES"/>
+        </w:rPr>
+        <w:t xml:space="preserve">a) completar los datos que faltan. </w:t>
+      </w:r>
+    </w:p>
+    <w:p>
+      <w:pPr>
         <w:ind w:firstLine="720"/>
         <w:rPr>
           <w:rFonts w:ascii="Arial" w:hAnsi="Arial" w:cs="Arial"/>
@@ -2184,17 +2311,7 @@
           <w:szCs w:val="24"/>
           <w:lang w:val="es-ES"/>
         </w:rPr>
-        <w:t xml:space="preserve">, cuando </w:t>
-      </w:r>
-      <w:r>
-        <w:rPr>
-          <w:rFonts w:ascii="Arial" w:hAnsi="Arial" w:cs="Arial"/>
-          <w:sz w:val="24"/>
-          <w:szCs w:val="24"/>
-          <w:lang w:val="es-ES"/>
-        </w:rPr>
-        <w:lastRenderedPageBreak/>
-        <w:t>observamos un tiempo 10</w:t>
+        <w:t>, cuando observamos un tiempo 10</w:t>
       </w:r>
       <w:r>
         <w:rPr>
@@ -2356,8 +2473,6 @@
         <w:br/>
         <w:t>T(n)</w:t>
       </w:r>
-      <w:bookmarkStart w:id="0" w:name="_GoBack"/>
-      <w:bookmarkEnd w:id="0"/>
       <w:r>
         <w:rPr>
           <w:rFonts w:ascii="Arial" w:eastAsia="Times New Roman" w:hAnsi="Arial" w:cs="Arial"/>
@@ -4308,8 +4423,19 @@
                 <w:szCs w:val="24"/>
                 <w:lang w:val="es-ES"/>
               </w:rPr>
-              <w:t xml:space="preserve">  / seg</w:t>
-            </w:r>
+              <w:t xml:space="preserve">  / </w:t>
+            </w:r>
+            <w:proofErr w:type="spellStart"/>
+            <w:r>
+              <w:rPr>
+                <w:rFonts w:ascii="Arial" w:hAnsi="Arial" w:cs="Arial"/>
+                <w:sz w:val="24"/>
+                <w:szCs w:val="24"/>
+                <w:lang w:val="es-ES"/>
+              </w:rPr>
+              <w:t>seg</w:t>
+            </w:r>
+            <w:proofErr w:type="spellEnd"/>
           </w:p>
         </w:tc>
         <w:tc>
@@ -4421,7 +4547,27 @@
                 <w:szCs w:val="24"/>
                 <w:lang w:val="es-ES"/>
               </w:rPr>
-              <w:t xml:space="preserve">  / hs.</w:t>
+              <w:t xml:space="preserve">  / </w:t>
+            </w:r>
+            <w:proofErr w:type="spellStart"/>
+            <w:r>
+              <w:rPr>
+                <w:rFonts w:ascii="Arial" w:hAnsi="Arial" w:cs="Arial"/>
+                <w:sz w:val="24"/>
+                <w:szCs w:val="24"/>
+                <w:lang w:val="es-ES"/>
+              </w:rPr>
+              <w:t>hs</w:t>
+            </w:r>
+            <w:proofErr w:type="spellEnd"/>
+            <w:r>
+              <w:rPr>
+                <w:rFonts w:ascii="Arial" w:hAnsi="Arial" w:cs="Arial"/>
+                <w:sz w:val="24"/>
+                <w:szCs w:val="24"/>
+                <w:lang w:val="es-ES"/>
+              </w:rPr>
+              <w:t>.</w:t>
             </w:r>
           </w:p>
         </w:tc>
@@ -4763,6 +4909,7 @@
                 <w:szCs w:val="24"/>
                 <w:lang w:val="es-ES"/>
               </w:rPr>
+              <w:lastRenderedPageBreak/>
               <w:t>n</w:t>
             </w:r>
             <w:r>
@@ -5232,7 +5379,26 @@
           <w:lang w:val="es-ES"/>
         </w:rPr>
         <w:br/>
-        <w:t>n = 60</w:t>
+      </w:r>
+      <w:proofErr w:type="spellStart"/>
+      <w:r>
+        <w:rPr>
+          <w:rFonts w:ascii="Arial" w:hAnsi="Arial" w:cs="Arial"/>
+          <w:sz w:val="24"/>
+          <w:szCs w:val="24"/>
+          <w:lang w:val="es-ES"/>
+        </w:rPr>
+        <w:t>n</w:t>
+      </w:r>
+      <w:proofErr w:type="spellEnd"/>
+      <w:r>
+        <w:rPr>
+          <w:rFonts w:ascii="Arial" w:hAnsi="Arial" w:cs="Arial"/>
+          <w:sz w:val="24"/>
+          <w:szCs w:val="24"/>
+          <w:lang w:val="es-ES"/>
+        </w:rPr>
+        <w:t xml:space="preserve"> = 60</w:t>
       </w:r>
       <w:r>
         <w:rPr>
@@ -5243,56 +5409,6 @@
         </w:rPr>
         <w:t>000</w:t>
       </w:r>
-    </w:p>
-    <w:p>
-      <w:pPr>
-        <w:rPr>
-          <w:rFonts w:ascii="Arial" w:hAnsi="Arial" w:cs="Arial"/>
-          <w:sz w:val="24"/>
-          <w:szCs w:val="24"/>
-          <w:lang w:val="es-ES"/>
-        </w:rPr>
-      </w:pPr>
-    </w:p>
-    <w:p>
-      <w:pPr>
-        <w:rPr>
-          <w:rFonts w:ascii="Arial" w:hAnsi="Arial" w:cs="Arial"/>
-          <w:sz w:val="24"/>
-          <w:szCs w:val="24"/>
-          <w:lang w:val="es-ES"/>
-        </w:rPr>
-      </w:pPr>
-    </w:p>
-    <w:p>
-      <w:pPr>
-        <w:rPr>
-          <w:rFonts w:ascii="Arial" w:hAnsi="Arial" w:cs="Arial"/>
-          <w:sz w:val="24"/>
-          <w:szCs w:val="24"/>
-          <w:lang w:val="es-ES"/>
-        </w:rPr>
-      </w:pPr>
-    </w:p>
-    <w:p>
-      <w:pPr>
-        <w:rPr>
-          <w:rFonts w:ascii="Arial" w:hAnsi="Arial" w:cs="Arial"/>
-          <w:sz w:val="24"/>
-          <w:szCs w:val="24"/>
-          <w:lang w:val="es-ES"/>
-        </w:rPr>
-      </w:pPr>
-    </w:p>
-    <w:p>
-      <w:pPr>
-        <w:rPr>
-          <w:rFonts w:ascii="Arial" w:hAnsi="Arial" w:cs="Arial"/>
-          <w:sz w:val="24"/>
-          <w:szCs w:val="24"/>
-          <w:lang w:val="es-ES"/>
-        </w:rPr>
-      </w:pPr>
     </w:p>
     <w:p>
       <w:pPr>
@@ -5413,8 +5529,18 @@
                 <w:sz w:val="24"/>
                 <w:szCs w:val="24"/>
               </w:rPr>
-              <w:t xml:space="preserve">  / seg</w:t>
-            </w:r>
+              <w:t xml:space="preserve">  / </w:t>
+            </w:r>
+            <w:proofErr w:type="spellStart"/>
+            <w:r>
+              <w:rPr>
+                <w:rFonts w:ascii="Arial" w:hAnsi="Arial" w:cs="Arial"/>
+                <w:sz w:val="24"/>
+                <w:szCs w:val="24"/>
+              </w:rPr>
+              <w:t>seg</w:t>
+            </w:r>
+            <w:proofErr w:type="spellEnd"/>
           </w:p>
         </w:tc>
         <w:tc>
@@ -5449,8 +5575,54 @@
                 <w:sz w:val="24"/>
                 <w:szCs w:val="24"/>
               </w:rPr>
-              <w:t>10  veces más rápido</w:t>
-            </w:r>
+              <w:t xml:space="preserve">10  </w:t>
+            </w:r>
+            <w:proofErr w:type="spellStart"/>
+            <w:r>
+              <w:rPr>
+                <w:rFonts w:ascii="Arial" w:hAnsi="Arial" w:cs="Arial"/>
+                <w:sz w:val="24"/>
+                <w:szCs w:val="24"/>
+              </w:rPr>
+              <w:t>veces</w:t>
+            </w:r>
+            <w:proofErr w:type="spellEnd"/>
+            <w:r>
+              <w:rPr>
+                <w:rFonts w:ascii="Arial" w:hAnsi="Arial" w:cs="Arial"/>
+                <w:sz w:val="24"/>
+                <w:szCs w:val="24"/>
+              </w:rPr>
+              <w:t xml:space="preserve"> </w:t>
+            </w:r>
+            <w:proofErr w:type="spellStart"/>
+            <w:r>
+              <w:rPr>
+                <w:rFonts w:ascii="Arial" w:hAnsi="Arial" w:cs="Arial"/>
+                <w:sz w:val="24"/>
+                <w:szCs w:val="24"/>
+              </w:rPr>
+              <w:t>más</w:t>
+            </w:r>
+            <w:proofErr w:type="spellEnd"/>
+            <w:r>
+              <w:rPr>
+                <w:rFonts w:ascii="Arial" w:hAnsi="Arial" w:cs="Arial"/>
+                <w:sz w:val="24"/>
+                <w:szCs w:val="24"/>
+              </w:rPr>
+              <w:t xml:space="preserve"> </w:t>
+            </w:r>
+            <w:proofErr w:type="spellStart"/>
+            <w:r>
+              <w:rPr>
+                <w:rFonts w:ascii="Arial" w:hAnsi="Arial" w:cs="Arial"/>
+                <w:sz w:val="24"/>
+                <w:szCs w:val="24"/>
+              </w:rPr>
+              <w:t>rápido</w:t>
+            </w:r>
+            <w:proofErr w:type="spellEnd"/>
           </w:p>
         </w:tc>
       </w:tr>
@@ -6159,7 +6331,27 @@
           <w:szCs w:val="24"/>
           <w:lang w:val="es-ES"/>
         </w:rPr>
-        <w:t>Ambas formas de calcular el factorial (recursivo e iterativo) conllevan una complejidad O(n). Por más que la recursiva implique, valga la redundancia, recursividad, esta solo se utiliza para llamarse a</w:t>
+        <w:t xml:space="preserve">Ambas formas de calcular </w:t>
+      </w:r>
+      <w:proofErr w:type="gramStart"/>
+      <w:r>
+        <w:rPr>
+          <w:rFonts w:ascii="Arial" w:hAnsi="Arial" w:cs="Arial"/>
+          <w:sz w:val="24"/>
+          <w:szCs w:val="24"/>
+          <w:lang w:val="es-ES"/>
+        </w:rPr>
+        <w:t>el factorial</w:t>
+      </w:r>
+      <w:proofErr w:type="gramEnd"/>
+      <w:r>
+        <w:rPr>
+          <w:rFonts w:ascii="Arial" w:hAnsi="Arial" w:cs="Arial"/>
+          <w:sz w:val="24"/>
+          <w:szCs w:val="24"/>
+          <w:lang w:val="es-ES"/>
+        </w:rPr>
+        <w:t xml:space="preserve"> (recursivo e iterativo) conllevan una complejidad O(n). Por más que la recursiva implique, valga la redundancia, recursividad, esta solo se utiliza para llamarse a</w:t>
       </w:r>
       <w:r>
         <w:rPr>
@@ -6202,6 +6394,7 @@
         </w:rPr>
         <w:tab/>
       </w:r>
+      <w:proofErr w:type="gramStart"/>
       <w:r>
         <w:rPr>
           <w:rFonts w:ascii="Consolas" w:hAnsi="Consolas" w:cs="Consolas"/>
@@ -6213,6 +6406,7 @@
         </w:rPr>
         <w:t>public</w:t>
       </w:r>
+      <w:proofErr w:type="gramEnd"/>
       <w:r>
         <w:rPr>
           <w:rFonts w:ascii="Consolas" w:hAnsi="Consolas" w:cs="Consolas"/>
@@ -6260,8 +6454,29 @@
           <w:sz w:val="20"/>
           <w:szCs w:val="20"/>
         </w:rPr>
-        <w:t xml:space="preserve"> factorialRecursivo(</w:t>
-      </w:r>
+        <w:t xml:space="preserve"> </w:t>
+      </w:r>
+      <w:proofErr w:type="spellStart"/>
+      <w:r>
+        <w:rPr>
+          <w:rFonts w:ascii="Consolas" w:hAnsi="Consolas" w:cs="Consolas"/>
+          <w:color w:val="000000"/>
+          <w:sz w:val="20"/>
+          <w:szCs w:val="20"/>
+        </w:rPr>
+        <w:t>factorialRecursivo</w:t>
+      </w:r>
+      <w:proofErr w:type="spellEnd"/>
+      <w:r>
+        <w:rPr>
+          <w:rFonts w:ascii="Consolas" w:hAnsi="Consolas" w:cs="Consolas"/>
+          <w:color w:val="000000"/>
+          <w:sz w:val="20"/>
+          <w:szCs w:val="20"/>
+        </w:rPr>
+        <w:t>(</w:t>
+      </w:r>
+      <w:proofErr w:type="spellStart"/>
       <w:r>
         <w:rPr>
           <w:rFonts w:ascii="Consolas" w:hAnsi="Consolas" w:cs="Consolas"/>
@@ -6273,6 +6488,7 @@
         </w:rPr>
         <w:t>int</w:t>
       </w:r>
+      <w:proofErr w:type="spellEnd"/>
       <w:r>
         <w:rPr>
           <w:rFonts w:ascii="Consolas" w:hAnsi="Consolas" w:cs="Consolas"/>
@@ -6331,6 +6547,7 @@
         </w:rPr>
         <w:tab/>
       </w:r>
+      <w:proofErr w:type="gramStart"/>
       <w:r>
         <w:rPr>
           <w:rFonts w:ascii="Consolas" w:hAnsi="Consolas" w:cs="Consolas"/>
@@ -6342,6 +6559,7 @@
         </w:rPr>
         <w:t>if</w:t>
       </w:r>
+      <w:proofErr w:type="gramEnd"/>
       <w:r>
         <w:rPr>
           <w:rFonts w:ascii="Consolas" w:hAnsi="Consolas" w:cs="Consolas"/>
@@ -6409,6 +6627,7 @@
         </w:rPr>
         <w:tab/>
       </w:r>
+      <w:proofErr w:type="gramStart"/>
       <w:r>
         <w:rPr>
           <w:rFonts w:ascii="Consolas" w:hAnsi="Consolas" w:cs="Consolas"/>
@@ -6420,6 +6639,7 @@
         </w:rPr>
         <w:t>return</w:t>
       </w:r>
+      <w:proofErr w:type="gramEnd"/>
       <w:r>
         <w:rPr>
           <w:rFonts w:ascii="Consolas" w:hAnsi="Consolas" w:cs="Consolas"/>
@@ -6460,6 +6680,7 @@
         </w:rPr>
         <w:tab/>
       </w:r>
+      <w:proofErr w:type="gramStart"/>
       <w:r>
         <w:rPr>
           <w:rFonts w:ascii="Consolas" w:hAnsi="Consolas" w:cs="Consolas"/>
@@ -6471,6 +6692,7 @@
         </w:rPr>
         <w:t>return</w:t>
       </w:r>
+      <w:proofErr w:type="gramEnd"/>
       <w:r>
         <w:rPr>
           <w:rFonts w:ascii="Consolas" w:hAnsi="Consolas" w:cs="Consolas"/>
@@ -6498,6 +6720,7 @@
         </w:rPr>
         <w:t xml:space="preserve"> * </w:t>
       </w:r>
+      <w:proofErr w:type="spellStart"/>
       <w:r>
         <w:rPr>
           <w:rFonts w:ascii="Consolas" w:hAnsi="Consolas" w:cs="Consolas"/>
@@ -6509,6 +6732,7 @@
         </w:rPr>
         <w:t>factorialRecursivo</w:t>
       </w:r>
+      <w:proofErr w:type="spellEnd"/>
       <w:r>
         <w:rPr>
           <w:rFonts w:ascii="Consolas" w:hAnsi="Consolas" w:cs="Consolas"/>
@@ -6603,6 +6827,7 @@
         </w:rPr>
         <w:tab/>
       </w:r>
+      <w:proofErr w:type="gramStart"/>
       <w:r>
         <w:rPr>
           <w:rFonts w:ascii="Consolas" w:hAnsi="Consolas" w:cs="Consolas"/>
@@ -6614,6 +6839,7 @@
         </w:rPr>
         <w:t>public</w:t>
       </w:r>
+      <w:proofErr w:type="gramEnd"/>
       <w:r>
         <w:rPr>
           <w:rFonts w:ascii="Consolas" w:hAnsi="Consolas" w:cs="Consolas"/>
@@ -6661,7 +6887,27 @@
           <w:sz w:val="20"/>
           <w:szCs w:val="20"/>
         </w:rPr>
-        <w:t xml:space="preserve"> factorialIterativo(</w:t>
+        <w:t xml:space="preserve"> </w:t>
+      </w:r>
+      <w:proofErr w:type="spellStart"/>
+      <w:r>
+        <w:rPr>
+          <w:rFonts w:ascii="Consolas" w:hAnsi="Consolas" w:cs="Consolas"/>
+          <w:color w:val="000000"/>
+          <w:sz w:val="20"/>
+          <w:szCs w:val="20"/>
+        </w:rPr>
+        <w:t>factorialIterativo</w:t>
+      </w:r>
+      <w:proofErr w:type="spellEnd"/>
+      <w:r>
+        <w:rPr>
+          <w:rFonts w:ascii="Consolas" w:hAnsi="Consolas" w:cs="Consolas"/>
+          <w:color w:val="000000"/>
+          <w:sz w:val="20"/>
+          <w:szCs w:val="20"/>
+        </w:rPr>
+        <w:t>(</w:t>
       </w:r>
       <w:r>
         <w:rPr>
@@ -6732,6 +6978,7 @@
         </w:rPr>
         <w:tab/>
       </w:r>
+      <w:proofErr w:type="gramStart"/>
       <w:r>
         <w:rPr>
           <w:rFonts w:ascii="Consolas" w:hAnsi="Consolas" w:cs="Consolas"/>
@@ -6743,6 +6990,7 @@
         </w:rPr>
         <w:t>long</w:t>
       </w:r>
+      <w:proofErr w:type="gramEnd"/>
       <w:r>
         <w:rPr>
           <w:rFonts w:ascii="Consolas" w:hAnsi="Consolas" w:cs="Consolas"/>
@@ -6850,6 +7098,7 @@
         </w:rPr>
         <w:tab/>
       </w:r>
+      <w:proofErr w:type="gramStart"/>
       <w:r>
         <w:rPr>
           <w:rFonts w:ascii="Consolas" w:hAnsi="Consolas" w:cs="Consolas"/>
@@ -6861,6 +7110,7 @@
         </w:rPr>
         <w:t>for</w:t>
       </w:r>
+      <w:proofErr w:type="gramEnd"/>
       <w:r>
         <w:rPr>
           <w:rFonts w:ascii="Consolas" w:hAnsi="Consolas" w:cs="Consolas"/>
@@ -6870,6 +7120,7 @@
         </w:rPr>
         <w:t xml:space="preserve"> (</w:t>
       </w:r>
+      <w:proofErr w:type="spellStart"/>
       <w:r>
         <w:rPr>
           <w:rFonts w:ascii="Consolas" w:hAnsi="Consolas" w:cs="Consolas"/>
@@ -6881,6 +7132,7 @@
         </w:rPr>
         <w:t>int</w:t>
       </w:r>
+      <w:proofErr w:type="spellEnd"/>
       <w:r>
         <w:rPr>
           <w:rFonts w:ascii="Consolas" w:hAnsi="Consolas" w:cs="Consolas"/>
@@ -6890,6 +7142,7 @@
         </w:rPr>
         <w:t xml:space="preserve"> </w:t>
       </w:r>
+      <w:proofErr w:type="spellStart"/>
       <w:r>
         <w:rPr>
           <w:rFonts w:ascii="Consolas" w:hAnsi="Consolas" w:cs="Consolas"/>
@@ -6899,6 +7152,7 @@
         </w:rPr>
         <w:t>i</w:t>
       </w:r>
+      <w:proofErr w:type="spellEnd"/>
       <w:r>
         <w:rPr>
           <w:rFonts w:ascii="Consolas" w:hAnsi="Consolas" w:cs="Consolas"/>
@@ -6908,6 +7162,7 @@
         </w:rPr>
         <w:t xml:space="preserve"> = 1; </w:t>
       </w:r>
+      <w:proofErr w:type="spellStart"/>
       <w:r>
         <w:rPr>
           <w:rFonts w:ascii="Consolas" w:hAnsi="Consolas" w:cs="Consolas"/>
@@ -6917,6 +7172,7 @@
         </w:rPr>
         <w:t>i</w:t>
       </w:r>
+      <w:proofErr w:type="spellEnd"/>
       <w:r>
         <w:rPr>
           <w:rFonts w:ascii="Consolas" w:hAnsi="Consolas" w:cs="Consolas"/>
@@ -6944,6 +7200,7 @@
         </w:rPr>
         <w:t xml:space="preserve">; </w:t>
       </w:r>
+      <w:proofErr w:type="spellStart"/>
       <w:r>
         <w:rPr>
           <w:rFonts w:ascii="Consolas" w:hAnsi="Consolas" w:cs="Consolas"/>
@@ -6953,6 +7210,7 @@
         </w:rPr>
         <w:t>i</w:t>
       </w:r>
+      <w:proofErr w:type="spellEnd"/>
       <w:r>
         <w:rPr>
           <w:rFonts w:ascii="Consolas" w:hAnsi="Consolas" w:cs="Consolas"/>
@@ -7146,6 +7404,7 @@
         </w:rPr>
         <w:tab/>
       </w:r>
+      <w:proofErr w:type="spellStart"/>
       <w:r>
         <w:rPr>
           <w:rFonts w:ascii="Consolas" w:hAnsi="Consolas" w:cs="Consolas"/>
@@ -7158,6 +7417,7 @@
         </w:rPr>
         <w:t>return</w:t>
       </w:r>
+      <w:proofErr w:type="spellEnd"/>
       <w:r>
         <w:rPr>
           <w:rFonts w:ascii="Consolas" w:hAnsi="Consolas" w:cs="Consolas"/>
@@ -7239,7 +7499,29 @@
           <w:szCs w:val="24"/>
           <w:lang w:val="es-ES"/>
         </w:rPr>
-        <w:t>el factorial recursivo en varias ocasiones arrojó un tiempo de ejecución menor.</w:t>
+        <w:t xml:space="preserve">el </w:t>
+      </w:r>
+      <w:proofErr w:type="gramStart"/>
+      <w:r>
+        <w:rPr>
+          <w:rFonts w:ascii="Arial" w:hAnsi="Arial" w:cs="Arial"/>
+          <w:color w:val="000000"/>
+          <w:sz w:val="24"/>
+          <w:szCs w:val="24"/>
+          <w:lang w:val="es-ES"/>
+        </w:rPr>
+        <w:t>factorial recursivo</w:t>
+      </w:r>
+      <w:proofErr w:type="gramEnd"/>
+      <w:r>
+        <w:rPr>
+          <w:rFonts w:ascii="Arial" w:hAnsi="Arial" w:cs="Arial"/>
+          <w:color w:val="000000"/>
+          <w:sz w:val="24"/>
+          <w:szCs w:val="24"/>
+          <w:lang w:val="es-ES"/>
+        </w:rPr>
+        <w:t xml:space="preserve"> en varias ocasiones arrojó un tiempo de ejecución menor.</w:t>
       </w:r>
     </w:p>
     <w:p>
@@ -7274,6 +7556,7 @@
         </w:rPr>
         <w:tab/>
       </w:r>
+      <w:proofErr w:type="gramStart"/>
       <w:r>
         <w:rPr>
           <w:rFonts w:ascii="Consolas" w:hAnsi="Consolas" w:cs="Consolas"/>
@@ -7285,6 +7568,7 @@
         </w:rPr>
         <w:t>long</w:t>
       </w:r>
+      <w:proofErr w:type="gramEnd"/>
       <w:r>
         <w:rPr>
           <w:rFonts w:ascii="Consolas" w:hAnsi="Consolas" w:cs="Consolas"/>
@@ -7310,7 +7594,17 @@
           <w:sz w:val="20"/>
           <w:szCs w:val="20"/>
         </w:rPr>
-        <w:t xml:space="preserve"> = System.</w:t>
+        <w:t xml:space="preserve"> = </w:t>
+      </w:r>
+      <w:proofErr w:type="spellStart"/>
+      <w:r>
+        <w:rPr>
+          <w:rFonts w:ascii="Consolas" w:hAnsi="Consolas" w:cs="Consolas"/>
+          <w:color w:val="000000"/>
+          <w:sz w:val="20"/>
+          <w:szCs w:val="20"/>
+        </w:rPr>
+        <w:t>System.</w:t>
       </w:r>
       <w:r>
         <w:rPr>
@@ -7323,6 +7617,7 @@
         </w:rPr>
         <w:t>currentTimeMillis</w:t>
       </w:r>
+      <w:proofErr w:type="spellEnd"/>
       <w:r>
         <w:rPr>
           <w:rFonts w:ascii="Consolas" w:hAnsi="Consolas" w:cs="Consolas"/>
@@ -7332,6 +7627,7 @@
         </w:rPr>
         <w:t xml:space="preserve">(), </w:t>
       </w:r>
+      <w:proofErr w:type="spellStart"/>
       <w:r>
         <w:rPr>
           <w:rFonts w:ascii="Consolas" w:hAnsi="Consolas" w:cs="Consolas"/>
@@ -7341,6 +7637,7 @@
         </w:rPr>
         <w:t>endTime</w:t>
       </w:r>
+      <w:proofErr w:type="spellEnd"/>
       <w:r>
         <w:rPr>
           <w:rFonts w:ascii="Consolas" w:hAnsi="Consolas" w:cs="Consolas"/>
@@ -7398,6 +7695,16 @@
           <w:szCs w:val="20"/>
         </w:rPr>
         <w:tab/>
+      </w:r>
+      <w:proofErr w:type="spellStart"/>
+      <w:proofErr w:type="gramStart"/>
+      <w:r>
+        <w:rPr>
+          <w:rFonts w:ascii="Consolas" w:hAnsi="Consolas" w:cs="Consolas"/>
+          <w:color w:val="000000"/>
+          <w:sz w:val="20"/>
+          <w:szCs w:val="20"/>
+        </w:rPr>
         <w:t>System.</w:t>
       </w:r>
       <w:r>
@@ -7420,8 +7727,20 @@
           <w:sz w:val="20"/>
           <w:szCs w:val="20"/>
         </w:rPr>
-        <w:t>.println(</w:t>
-      </w:r>
+        <w:t>.println</w:t>
+      </w:r>
+      <w:proofErr w:type="spellEnd"/>
+      <w:r>
+        <w:rPr>
+          <w:rFonts w:ascii="Consolas" w:hAnsi="Consolas" w:cs="Consolas"/>
+          <w:color w:val="000000"/>
+          <w:sz w:val="20"/>
+          <w:szCs w:val="20"/>
+        </w:rPr>
+        <w:t>(</w:t>
+      </w:r>
+      <w:proofErr w:type="spellStart"/>
+      <w:proofErr w:type="gramEnd"/>
       <w:r>
         <w:rPr>
           <w:rFonts w:ascii="Consolas" w:hAnsi="Consolas" w:cs="Consolas"/>
@@ -7433,6 +7752,7 @@
         </w:rPr>
         <w:t>factorialIterativo</w:t>
       </w:r>
+      <w:proofErr w:type="spellEnd"/>
       <w:r>
         <w:rPr>
           <w:rFonts w:ascii="Consolas" w:hAnsi="Consolas" w:cs="Consolas"/>
@@ -7473,6 +7793,7 @@
         </w:rPr>
         <w:tab/>
       </w:r>
+      <w:proofErr w:type="gramStart"/>
       <w:r>
         <w:rPr>
           <w:rFonts w:ascii="Consolas" w:hAnsi="Consolas" w:cs="Consolas"/>
@@ -7484,6 +7805,7 @@
         </w:rPr>
         <w:t>for</w:t>
       </w:r>
+      <w:proofErr w:type="gramEnd"/>
       <w:r>
         <w:rPr>
           <w:rFonts w:ascii="Consolas" w:hAnsi="Consolas" w:cs="Consolas"/>
@@ -7493,6 +7815,7 @@
         </w:rPr>
         <w:t xml:space="preserve"> (</w:t>
       </w:r>
+      <w:proofErr w:type="spellStart"/>
       <w:r>
         <w:rPr>
           <w:rFonts w:ascii="Consolas" w:hAnsi="Consolas" w:cs="Consolas"/>
@@ -7504,6 +7827,7 @@
         </w:rPr>
         <w:t>int</w:t>
       </w:r>
+      <w:proofErr w:type="spellEnd"/>
       <w:r>
         <w:rPr>
           <w:rFonts w:ascii="Consolas" w:hAnsi="Consolas" w:cs="Consolas"/>
@@ -7513,6 +7837,7 @@
         </w:rPr>
         <w:t xml:space="preserve"> </w:t>
       </w:r>
+      <w:proofErr w:type="spellStart"/>
       <w:r>
         <w:rPr>
           <w:rFonts w:ascii="Consolas" w:hAnsi="Consolas" w:cs="Consolas"/>
@@ -7522,6 +7847,7 @@
         </w:rPr>
         <w:t>i</w:t>
       </w:r>
+      <w:proofErr w:type="spellEnd"/>
       <w:r>
         <w:rPr>
           <w:rFonts w:ascii="Consolas" w:hAnsi="Consolas" w:cs="Consolas"/>
@@ -7531,6 +7857,7 @@
         </w:rPr>
         <w:t xml:space="preserve"> = 0; </w:t>
       </w:r>
+      <w:proofErr w:type="spellStart"/>
       <w:r>
         <w:rPr>
           <w:rFonts w:ascii="Consolas" w:hAnsi="Consolas" w:cs="Consolas"/>
@@ -7540,6 +7867,7 @@
         </w:rPr>
         <w:t>i</w:t>
       </w:r>
+      <w:proofErr w:type="spellEnd"/>
       <w:r>
         <w:rPr>
           <w:rFonts w:ascii="Consolas" w:hAnsi="Consolas" w:cs="Consolas"/>
@@ -7549,6 +7877,7 @@
         </w:rPr>
         <w:t xml:space="preserve"> &lt; 100000000; </w:t>
       </w:r>
+      <w:proofErr w:type="spellStart"/>
       <w:r>
         <w:rPr>
           <w:rFonts w:ascii="Consolas" w:hAnsi="Consolas" w:cs="Consolas"/>
@@ -7558,6 +7887,7 @@
         </w:rPr>
         <w:t>i</w:t>
       </w:r>
+      <w:proofErr w:type="spellEnd"/>
       <w:r>
         <w:rPr>
           <w:rFonts w:ascii="Consolas" w:hAnsi="Consolas" w:cs="Consolas"/>
@@ -7587,6 +7917,7 @@
           <w:sz w:val="20"/>
           <w:szCs w:val="20"/>
         </w:rPr>
+        <w:lastRenderedPageBreak/>
         <w:tab/>
       </w:r>
       <w:r>
@@ -7597,6 +7928,16 @@
           <w:szCs w:val="20"/>
         </w:rPr>
         <w:tab/>
+      </w:r>
+      <w:proofErr w:type="spellStart"/>
+      <w:proofErr w:type="gramStart"/>
+      <w:r>
+        <w:rPr>
+          <w:rFonts w:ascii="Consolas" w:hAnsi="Consolas" w:cs="Consolas"/>
+          <w:color w:val="000000"/>
+          <w:sz w:val="20"/>
+          <w:szCs w:val="20"/>
+        </w:rPr>
         <w:t>System.</w:t>
       </w:r>
       <w:r>
@@ -7619,7 +7960,28 @@
           <w:sz w:val="20"/>
           <w:szCs w:val="20"/>
         </w:rPr>
-        <w:t>.println(System.</w:t>
+        <w:t>.println</w:t>
+      </w:r>
+      <w:proofErr w:type="spellEnd"/>
+      <w:r>
+        <w:rPr>
+          <w:rFonts w:ascii="Consolas" w:hAnsi="Consolas" w:cs="Consolas"/>
+          <w:color w:val="000000"/>
+          <w:sz w:val="20"/>
+          <w:szCs w:val="20"/>
+        </w:rPr>
+        <w:t>(</w:t>
+      </w:r>
+      <w:proofErr w:type="spellStart"/>
+      <w:proofErr w:type="gramEnd"/>
+      <w:r>
+        <w:rPr>
+          <w:rFonts w:ascii="Consolas" w:hAnsi="Consolas" w:cs="Consolas"/>
+          <w:color w:val="000000"/>
+          <w:sz w:val="20"/>
+          <w:szCs w:val="20"/>
+        </w:rPr>
+        <w:t>System.</w:t>
       </w:r>
       <w:r>
         <w:rPr>
@@ -7632,6 +7994,7 @@
         </w:rPr>
         <w:t>currentTimeMillis</w:t>
       </w:r>
+      <w:proofErr w:type="spellEnd"/>
       <w:r>
         <w:rPr>
           <w:rFonts w:ascii="Consolas" w:hAnsi="Consolas" w:cs="Consolas"/>
@@ -7721,6 +8084,7 @@
         </w:rPr>
         <w:tab/>
       </w:r>
+      <w:proofErr w:type="gramStart"/>
       <w:r>
         <w:rPr>
           <w:rFonts w:ascii="Consolas" w:hAnsi="Consolas" w:cs="Consolas"/>
@@ -7730,14 +8094,25 @@
         </w:rPr>
         <w:t>time</w:t>
       </w:r>
-      <w:r>
-        <w:rPr>
-          <w:rFonts w:ascii="Consolas" w:hAnsi="Consolas" w:cs="Consolas"/>
-          <w:color w:val="000000"/>
-          <w:sz w:val="20"/>
-          <w:szCs w:val="20"/>
-        </w:rPr>
-        <w:t xml:space="preserve"> = System.</w:t>
+      <w:proofErr w:type="gramEnd"/>
+      <w:r>
+        <w:rPr>
+          <w:rFonts w:ascii="Consolas" w:hAnsi="Consolas" w:cs="Consolas"/>
+          <w:color w:val="000000"/>
+          <w:sz w:val="20"/>
+          <w:szCs w:val="20"/>
+        </w:rPr>
+        <w:t xml:space="preserve"> = </w:t>
+      </w:r>
+      <w:proofErr w:type="spellStart"/>
+      <w:r>
+        <w:rPr>
+          <w:rFonts w:ascii="Consolas" w:hAnsi="Consolas" w:cs="Consolas"/>
+          <w:color w:val="000000"/>
+          <w:sz w:val="20"/>
+          <w:szCs w:val="20"/>
+        </w:rPr>
+        <w:t>System.</w:t>
       </w:r>
       <w:r>
         <w:rPr>
@@ -7750,6 +8125,7 @@
         </w:rPr>
         <w:t>currentTimeMillis</w:t>
       </w:r>
+      <w:proofErr w:type="spellEnd"/>
       <w:r>
         <w:rPr>
           <w:rFonts w:ascii="Consolas" w:hAnsi="Consolas" w:cs="Consolas"/>
@@ -7807,6 +8183,16 @@
           <w:szCs w:val="20"/>
         </w:rPr>
         <w:tab/>
+      </w:r>
+      <w:proofErr w:type="spellStart"/>
+      <w:proofErr w:type="gramStart"/>
+      <w:r>
+        <w:rPr>
+          <w:rFonts w:ascii="Consolas" w:hAnsi="Consolas" w:cs="Consolas"/>
+          <w:color w:val="000000"/>
+          <w:sz w:val="20"/>
+          <w:szCs w:val="20"/>
+        </w:rPr>
         <w:t>System.</w:t>
       </w:r>
       <w:r>
@@ -7829,8 +8215,20 @@
           <w:sz w:val="20"/>
           <w:szCs w:val="20"/>
         </w:rPr>
-        <w:t>.println(</w:t>
-      </w:r>
+        <w:t>.println</w:t>
+      </w:r>
+      <w:proofErr w:type="spellEnd"/>
+      <w:r>
+        <w:rPr>
+          <w:rFonts w:ascii="Consolas" w:hAnsi="Consolas" w:cs="Consolas"/>
+          <w:color w:val="000000"/>
+          <w:sz w:val="20"/>
+          <w:szCs w:val="20"/>
+        </w:rPr>
+        <w:t>(</w:t>
+      </w:r>
+      <w:proofErr w:type="spellStart"/>
+      <w:proofErr w:type="gramEnd"/>
       <w:r>
         <w:rPr>
           <w:rFonts w:ascii="Consolas" w:hAnsi="Consolas" w:cs="Consolas"/>
@@ -7843,6 +8241,7 @@
         </w:rPr>
         <w:t>factorialRecursivo</w:t>
       </w:r>
+      <w:proofErr w:type="spellEnd"/>
       <w:r>
         <w:rPr>
           <w:rFonts w:ascii="Consolas" w:hAnsi="Consolas" w:cs="Consolas"/>
@@ -7883,6 +8282,7 @@
         </w:rPr>
         <w:tab/>
       </w:r>
+      <w:proofErr w:type="gramStart"/>
       <w:r>
         <w:rPr>
           <w:rFonts w:ascii="Consolas" w:hAnsi="Consolas" w:cs="Consolas"/>
@@ -7894,6 +8294,7 @@
         </w:rPr>
         <w:t>for</w:t>
       </w:r>
+      <w:proofErr w:type="gramEnd"/>
       <w:r>
         <w:rPr>
           <w:rFonts w:ascii="Consolas" w:hAnsi="Consolas" w:cs="Consolas"/>
@@ -7903,6 +8304,7 @@
         </w:rPr>
         <w:t xml:space="preserve"> (</w:t>
       </w:r>
+      <w:proofErr w:type="spellStart"/>
       <w:r>
         <w:rPr>
           <w:rFonts w:ascii="Consolas" w:hAnsi="Consolas" w:cs="Consolas"/>
@@ -7914,6 +8316,7 @@
         </w:rPr>
         <w:t>int</w:t>
       </w:r>
+      <w:proofErr w:type="spellEnd"/>
       <w:r>
         <w:rPr>
           <w:rFonts w:ascii="Consolas" w:hAnsi="Consolas" w:cs="Consolas"/>
@@ -7923,6 +8326,7 @@
         </w:rPr>
         <w:t xml:space="preserve"> </w:t>
       </w:r>
+      <w:proofErr w:type="spellStart"/>
       <w:r>
         <w:rPr>
           <w:rFonts w:ascii="Consolas" w:hAnsi="Consolas" w:cs="Consolas"/>
@@ -7932,6 +8336,7 @@
         </w:rPr>
         <w:t>i</w:t>
       </w:r>
+      <w:proofErr w:type="spellEnd"/>
       <w:r>
         <w:rPr>
           <w:rFonts w:ascii="Consolas" w:hAnsi="Consolas" w:cs="Consolas"/>
@@ -7941,6 +8346,7 @@
         </w:rPr>
         <w:t xml:space="preserve"> = 0; </w:t>
       </w:r>
+      <w:proofErr w:type="spellStart"/>
       <w:r>
         <w:rPr>
           <w:rFonts w:ascii="Consolas" w:hAnsi="Consolas" w:cs="Consolas"/>
@@ -7950,6 +8356,7 @@
         </w:rPr>
         <w:t>i</w:t>
       </w:r>
+      <w:proofErr w:type="spellEnd"/>
       <w:r>
         <w:rPr>
           <w:rFonts w:ascii="Consolas" w:hAnsi="Consolas" w:cs="Consolas"/>
@@ -7959,6 +8366,7 @@
         </w:rPr>
         <w:t xml:space="preserve"> &lt; 100000000; </w:t>
       </w:r>
+      <w:proofErr w:type="spellStart"/>
       <w:r>
         <w:rPr>
           <w:rFonts w:ascii="Consolas" w:hAnsi="Consolas" w:cs="Consolas"/>
@@ -7968,6 +8376,7 @@
         </w:rPr>
         <w:t>i</w:t>
       </w:r>
+      <w:proofErr w:type="spellEnd"/>
       <w:r>
         <w:rPr>
           <w:rFonts w:ascii="Consolas" w:hAnsi="Consolas" w:cs="Consolas"/>
@@ -8008,6 +8417,8 @@
         </w:rPr>
         <w:tab/>
       </w:r>
+      <w:proofErr w:type="spellStart"/>
+      <w:proofErr w:type="gramStart"/>
       <w:r>
         <w:rPr>
           <w:rFonts w:ascii="Consolas" w:hAnsi="Consolas" w:cs="Consolas"/>
@@ -8017,14 +8428,26 @@
         </w:rPr>
         <w:t>endTime</w:t>
       </w:r>
-      <w:r>
-        <w:rPr>
-          <w:rFonts w:ascii="Consolas" w:hAnsi="Consolas" w:cs="Consolas"/>
-          <w:color w:val="000000"/>
-          <w:sz w:val="20"/>
-          <w:szCs w:val="20"/>
-        </w:rPr>
-        <w:t xml:space="preserve"> = System.</w:t>
+      <w:proofErr w:type="spellEnd"/>
+      <w:proofErr w:type="gramEnd"/>
+      <w:r>
+        <w:rPr>
+          <w:rFonts w:ascii="Consolas" w:hAnsi="Consolas" w:cs="Consolas"/>
+          <w:color w:val="000000"/>
+          <w:sz w:val="20"/>
+          <w:szCs w:val="20"/>
+        </w:rPr>
+        <w:t xml:space="preserve"> = </w:t>
+      </w:r>
+      <w:proofErr w:type="spellStart"/>
+      <w:r>
+        <w:rPr>
+          <w:rFonts w:ascii="Consolas" w:hAnsi="Consolas" w:cs="Consolas"/>
+          <w:color w:val="000000"/>
+          <w:sz w:val="20"/>
+          <w:szCs w:val="20"/>
+        </w:rPr>
+        <w:t>System.</w:t>
       </w:r>
       <w:r>
         <w:rPr>
@@ -8037,6 +8460,7 @@
         </w:rPr>
         <w:t>currentTimeMillis</w:t>
       </w:r>
+      <w:proofErr w:type="spellEnd"/>
       <w:r>
         <w:rPr>
           <w:rFonts w:ascii="Consolas" w:hAnsi="Consolas" w:cs="Consolas"/>
@@ -8073,6 +8497,16 @@
           <w:szCs w:val="20"/>
         </w:rPr>
         <w:tab/>
+      </w:r>
+      <w:proofErr w:type="spellStart"/>
+      <w:proofErr w:type="gramStart"/>
+      <w:r>
+        <w:rPr>
+          <w:rFonts w:ascii="Consolas" w:hAnsi="Consolas" w:cs="Consolas"/>
+          <w:color w:val="000000"/>
+          <w:sz w:val="20"/>
+          <w:szCs w:val="20"/>
+        </w:rPr>
         <w:t>System.</w:t>
       </w:r>
       <w:r>
@@ -8095,8 +8529,20 @@
           <w:sz w:val="20"/>
           <w:szCs w:val="20"/>
         </w:rPr>
-        <w:t>.println(</w:t>
-      </w:r>
+        <w:t>.println</w:t>
+      </w:r>
+      <w:proofErr w:type="spellEnd"/>
+      <w:r>
+        <w:rPr>
+          <w:rFonts w:ascii="Consolas" w:hAnsi="Consolas" w:cs="Consolas"/>
+          <w:color w:val="000000"/>
+          <w:sz w:val="20"/>
+          <w:szCs w:val="20"/>
+        </w:rPr>
+        <w:t>(</w:t>
+      </w:r>
+      <w:proofErr w:type="spellStart"/>
+      <w:proofErr w:type="gramEnd"/>
       <w:r>
         <w:rPr>
           <w:rFonts w:ascii="Consolas" w:hAnsi="Consolas" w:cs="Consolas"/>
@@ -8106,6 +8552,7 @@
         </w:rPr>
         <w:t>endTime</w:t>
       </w:r>
+      <w:proofErr w:type="spellEnd"/>
       <w:r>
         <w:rPr>
           <w:rFonts w:ascii="Consolas" w:hAnsi="Consolas" w:cs="Consolas"/>
@@ -8183,7 +8630,7 @@
                     <pic:cNvPicPr/>
                   </pic:nvPicPr>
                   <pic:blipFill>
-                    <a:blip r:embed="rId6">
+                    <a:blip r:embed="rId5">
                       <a:extLst>
                         <a:ext uri="{28A0092B-C50C-407E-A947-70E740481C1C}">
                           <a14:useLocalDpi xmlns:a14="http://schemas.microsoft.com/office/drawing/2010/main" val="0"/>
@@ -8219,14 +8666,45 @@
           <w:lang w:val="es-ES"/>
         </w:rPr>
       </w:pPr>
-      <w:r>
-        <w:rPr>
-          <w:rFonts w:ascii="Arial" w:hAnsi="Arial" w:cs="Arial"/>
-          <w:sz w:val="24"/>
-          <w:szCs w:val="24"/>
-          <w:lang w:val="es-ES"/>
-        </w:rPr>
-        <w:lastRenderedPageBreak/>
+    </w:p>
+    <w:p>
+      <w:pPr>
+        <w:rPr>
+          <w:rFonts w:ascii="Arial" w:hAnsi="Arial" w:cs="Arial"/>
+          <w:sz w:val="24"/>
+          <w:szCs w:val="24"/>
+          <w:lang w:val="es-ES"/>
+        </w:rPr>
+      </w:pPr>
+    </w:p>
+    <w:p>
+      <w:pPr>
+        <w:rPr>
+          <w:rFonts w:ascii="Arial" w:hAnsi="Arial" w:cs="Arial"/>
+          <w:sz w:val="24"/>
+          <w:szCs w:val="24"/>
+          <w:lang w:val="es-ES"/>
+        </w:rPr>
+      </w:pPr>
+    </w:p>
+    <w:p>
+      <w:pPr>
+        <w:rPr>
+          <w:rFonts w:ascii="Arial" w:hAnsi="Arial" w:cs="Arial"/>
+          <w:sz w:val="24"/>
+          <w:szCs w:val="24"/>
+          <w:lang w:val="es-ES"/>
+        </w:rPr>
+      </w:pPr>
+      <w:bookmarkStart w:id="0" w:name="_GoBack"/>
+      <w:bookmarkEnd w:id="0"/>
+      <w:r>
+        <w:rPr>
+          <w:rFonts w:ascii="Arial" w:hAnsi="Arial" w:cs="Arial"/>
+          <w:sz w:val="24"/>
+          <w:szCs w:val="24"/>
+          <w:lang w:val="es-ES"/>
+        </w:rPr>
         <w:t xml:space="preserve">14) </w:t>
       </w:r>
       <w:r>

</xml_diff>